<commit_message>
chore: synchronize updated thesis docx, regenerated pdf, and reproduction zip
</commit_message>
<xml_diff>
--- a/research_paper/reproduction_package/논문_오하율_261009.docx
+++ b/research_paper/reproduction_package/논문_오하율_261009.docx
@@ -44,26 +44,19 @@
     </w:p>
     <w:p>
       <w:pPr>
-        <w:spacing w:after="20"/>
+        <w:spacing w:after="0"/>
         <w:jc w:val="center"/>
         <w:rPr>
-          <w:lang w:eastAsia="ko-KR"/>
-        </w:rPr>
-      </w:pPr>
-      <w:r>
-        <w:rPr>
           <w:sz w:val="22"/>
           <w:lang w:eastAsia="ko-KR"/>
         </w:rPr>
+      </w:pPr>
+      <w:r>
+        <w:rPr>
+          <w:sz w:val="22"/>
+          <w:lang w:eastAsia="ko-KR"/>
+        </w:rPr>
         <w:t>오하율</w:t>
-      </w:r>
-      <w:r>
-        <w:rPr>
-          <w:sz w:val="22"/>
-          <w:vertAlign w:val="superscript"/>
-          <w:lang w:eastAsia="ko-KR"/>
-        </w:rPr>
-        <w:t>1</w:t>
       </w:r>
     </w:p>
     <w:p>
@@ -71,24 +64,16 @@
         <w:spacing w:after="0"/>
         <w:jc w:val="center"/>
         <w:rPr>
-          <w:sz w:val="18"/>
-          <w:lang w:eastAsia="ko-KR"/>
-        </w:rPr>
-      </w:pPr>
-      <w:r>
-        <w:rPr>
-          <w:sz w:val="18"/>
-          <w:vertAlign w:val="superscript"/>
-          <w:lang w:eastAsia="ko-KR"/>
-        </w:rPr>
-        <w:t>1</w:t>
-      </w:r>
-      <w:r>
-        <w:rPr>
-          <w:sz w:val="18"/>
-          <w:lang w:eastAsia="ko-KR"/>
-        </w:rPr>
-        <w:t xml:space="preserve"> 개인 연구자</w:t>
+          <w:sz w:val="22"/>
+          <w:lang w:eastAsia="ko-KR"/>
+        </w:rPr>
+      </w:pPr>
+      <w:r>
+        <w:rPr>
+          <w:sz w:val="22"/>
+          <w:lang w:eastAsia="ko-KR"/>
+        </w:rPr>
+        <w:t>개인 연구자</w:t>
       </w:r>
     </w:p>
     <w:p>
@@ -108,6 +93,7 @@
           <w:lang w:eastAsia="ko-KR"/>
         </w:rPr>
       </w:pPr>
+      <w:proofErr w:type="gramStart"/>
       <w:r>
         <w:rPr>
           <w:rFonts w:ascii="맑은 고딕" w:eastAsia="맑은 고딕" w:hAnsi="맑은 고딕"/>
@@ -117,6 +103,7 @@
         </w:rPr>
         <w:t>초  록</w:t>
       </w:r>
+      <w:proofErr w:type="gramEnd"/>
     </w:p>
     <w:p>
       <w:pPr>
@@ -131,7 +118,35 @@
         <w:rPr>
           <w:lang w:eastAsia="ko-KR"/>
         </w:rPr>
-        <w:t>본 연구는 의료기관에서 발생하는 미식별 입금과 사망환자의 미수령 환불금을 체계적으로 관리하기 위한 공공관리체계를 제안하는 데 목적이 있다. 진료비 수납·청구 업무는 병원정보시스템(HIS)을 중심으로 전산화되어 있으나, 입금자 명의가 환자와 다르거나 환자 개명 또는 가족관계 변동에 따라 기존 정보가 불충분해지면 입금이 미식별 상태로 남을 수 있다. 또한 환불금이 발생한 후 환자가 사망하면 사망 사실 확인과는 별도로 적법한 수령권자를 확인하는 절차가 요구되는데, 이는 의료기관이 보유한 정보만으로는 판단하기 어려운 영역이다.</w:t>
+        <w:t xml:space="preserve">본 연구는 의료기관에서 발생하는 미식별 입금과 사망환자의 미수령 환불금을 체계적으로 관리하기 위한 공공관리체계를 제안하는 데 목적이 있다. 진료비 수납·청구 업무는 병원정보시스템(HIS)을 중심으로 전산화되어 있으나, </w:t>
+      </w:r>
+      <w:proofErr w:type="spellStart"/>
+      <w:r>
+        <w:rPr>
+          <w:lang w:eastAsia="ko-KR"/>
+        </w:rPr>
+        <w:t>입금자</w:t>
+      </w:r>
+      <w:proofErr w:type="spellEnd"/>
+      <w:r>
+        <w:rPr>
+          <w:lang w:eastAsia="ko-KR"/>
+        </w:rPr>
+        <w:t xml:space="preserve"> 명의가 환자와 다르거나 환자 개명 또는 가족관계 변동에 따라 기존 정보가 불충분해지면 입금이 미식별 상태로 남을 수 있다. 또한 환불금이 발생한 후 환자가 사망하면 사망 사실 확인과는 별도로 적법한 </w:t>
+      </w:r>
+      <w:proofErr w:type="spellStart"/>
+      <w:r>
+        <w:rPr>
+          <w:lang w:eastAsia="ko-KR"/>
+        </w:rPr>
+        <w:t>수령권자를</w:t>
+      </w:r>
+      <w:proofErr w:type="spellEnd"/>
+      <w:r>
+        <w:rPr>
+          <w:lang w:eastAsia="ko-KR"/>
+        </w:rPr>
+        <w:t xml:space="preserve"> 확인하는 절차가 요구되는데, 이는 의료기관이 보유한 정보만으로는 판단하기 어려운 영역이다.</w:t>
       </w:r>
     </w:p>
     <w:p>
@@ -179,20 +194,57 @@
           <w:sz w:val="20"/>
           <w:lang w:eastAsia="ko-KR"/>
         </w:rPr>
-        <w:t>주제어: 병원정보시스템, 진료비 정산, 미식별 입금, 미수령 환불금, 공공행정정보</w:t>
+        <w:t xml:space="preserve">주제어: 병원정보시스템, 진료비 정산, 미식별 입금, 미수령 </w:t>
+      </w:r>
+      <w:proofErr w:type="spellStart"/>
+      <w:r>
+        <w:rPr>
+          <w:b/>
+          <w:sz w:val="20"/>
+          <w:lang w:eastAsia="ko-KR"/>
+        </w:rPr>
+        <w:t>환불금</w:t>
+      </w:r>
+      <w:proofErr w:type="spellEnd"/>
+      <w:r>
+        <w:rPr>
+          <w:b/>
+          <w:sz w:val="20"/>
+          <w:lang w:eastAsia="ko-KR"/>
+        </w:rPr>
+        <w:t>, 공공행정정보</w:t>
       </w:r>
     </w:p>
     <w:p>
       <w:pPr>
-        <w:spacing w:after="120"/>
-        <w:jc w:val="center"/>
-      </w:pPr>
-      <w:r>
+        <w:spacing w:after="200" w:line="276" w:lineRule="auto"/>
         <w:rPr>
           <w:rFonts w:ascii="맑은 고딕" w:eastAsia="맑은 고딕" w:hAnsi="맑은 고딕"/>
           <w:b/>
           <w:sz w:val="24"/>
         </w:rPr>
+      </w:pPr>
+      <w:r>
+        <w:rPr>
+          <w:rFonts w:ascii="맑은 고딕" w:eastAsia="맑은 고딕" w:hAnsi="맑은 고딕"/>
+          <w:b/>
+          <w:sz w:val="24"/>
+        </w:rPr>
+        <w:br w:type="page"/>
+      </w:r>
+    </w:p>
+    <w:p>
+      <w:pPr>
+        <w:spacing w:after="120"/>
+        <w:jc w:val="center"/>
+      </w:pPr>
+      <w:r>
+        <w:rPr>
+          <w:rFonts w:ascii="맑은 고딕" w:eastAsia="맑은 고딕" w:hAnsi="맑은 고딕"/>
+          <w:b/>
+          <w:sz w:val="24"/>
+        </w:rPr>
+        <w:lastRenderedPageBreak/>
         <w:t>Abstract</w:t>
       </w:r>
     </w:p>
@@ -253,6 +305,7 @@
           <w:sz w:val="26"/>
           <w:lang w:eastAsia="ko-KR"/>
         </w:rPr>
+        <w:lastRenderedPageBreak/>
         <w:t>Ⅰ. 서론</w:t>
       </w:r>
     </w:p>
@@ -269,7 +322,21 @@
         <w:rPr>
           <w:lang w:eastAsia="ko-KR"/>
         </w:rPr>
-        <w:t>우리나라 의료기관은 건강보험을 비롯한 다양한 진료비 지불체계에 따라 환자의 진료비를 산정·수납하고, 심사와 정산 과정을 거쳐 최종 진료비를 확정한다. 특히 입원환자는 재원기간 동안 진료행위와 검사, 처치, 약제 비용이 계속 발생하기 때문에 외래환자보다 원무행정이 복잡하며, 재원일수는 입원 진료비와 밀접하게 연관된 주요 요인이다(김상미 등, 2013). 대형 의료기관은 이러한 진료비 산정·수납과 청구 업무를 병원정보시스템(Hospital Information System; HIS)을 중심으로 수행한다. HIS는 환자 진료정보와 전자의무기록(Electronic Medical Record; EMR), 진료비 계산, 원무행정 정보를 통합하여 관리하는 핵심 정보시스템이다. 도입 이후 접수·수납·청구 업무의 처리 속도와 정확성이 크게 개선된 것으로 평가된다.</w:t>
+        <w:t>우리나라 의료기관은 건강보험을 비롯한 다양한 진료비 지불체계에 따라 환자의 진료비를 산정·수납하고, 심사와 정산 과정을 거쳐 최종 진료비를 확정한다. 특히 입원환자는 재원기간 동안 진료행위와 검사, 처치, 약제 비용이 계속 발생하기 때문에 외래환자보다 원무행정이 복잡하며, 재원일수는 입원 진료비와 밀접하게 연관된 주요 요인이다(</w:t>
+      </w:r>
+      <w:proofErr w:type="spellStart"/>
+      <w:r>
+        <w:rPr>
+          <w:lang w:eastAsia="ko-KR"/>
+        </w:rPr>
+        <w:t>김상미</w:t>
+      </w:r>
+      <w:proofErr w:type="spellEnd"/>
+      <w:r>
+        <w:rPr>
+          <w:lang w:eastAsia="ko-KR"/>
+        </w:rPr>
+        <w:t xml:space="preserve"> 등, 2013). 대형 의료기관은 이러한 진료비 산정·수납과 청구 업무를 병원정보시스템(Hospital Information System; HIS)을 중심으로 수행한다. HIS는 환자 진료정보와 전자의무기록(Electronic Medical Record; EMR), 진료비 계산, 원무행정 정보를 통합하여 관리하는 핵심 정보시스템이다. 도입 이후 접수·수납·청구 업무의 처리 속도와 정확성이 크게 개선된 것으로 평가된다.</w:t>
       </w:r>
     </w:p>
     <w:p>
@@ -285,7 +352,21 @@
         <w:rPr>
           <w:lang w:eastAsia="ko-KR"/>
         </w:rPr>
-        <w:t>그러나 전산화가 모든 정산 업무를 자동으로 처리하지는 못한다. 금융기관이 제공한 입금정보와 환자정보를 대조하거나, 사망환자 환불금을 지급하기 위해 상속인을 확인하는 업무처럼 기관 외부 정보를 확인해야 하는 절차는 여전히 수작업에 의존하고 있다(박찬석 등, 2008). 진료비 수납 수단이 현금에서 카드, 계좌이체, 가상계좌 등으로 다양해지면서 이러한 간극은 더 커진다. 보호자나 가족이 환자를 대신하여 진료비를 납부하면서 자신의 명의로 송금하는 경우, 금융기관이 제공하는 입금자명·입금일자·입금금액만으로는 HIS에 등록된 환자등록번호, 환자명, 진료비 정보를 자동으로 연결하기 어렵다. 결국 원무 담당자는 입금내역과 환자정보를 대조하여 해당 금액을 특정 환자의 진료비와 연결하는 확인 절차를 거쳐야 한다. 환자가 개명한 경우에도 과거 진료 당시의 성명과 현재 등록된 성명이 달라 유사한 문제가 발생한다.</w:t>
+        <w:t xml:space="preserve">그러나 전산화가 모든 정산 업무를 자동으로 처리하지는 못한다. 금융기관이 제공한 입금정보와 환자정보를 대조하거나, 사망환자 환불금을 지급하기 위해 상속인을 확인하는 업무처럼 기관 외부 정보를 확인해야 하는 절차는 여전히 수작업에 의존하고 있다(박찬석 등, 2008). 진료비 수납 수단이 현금에서 카드, 계좌이체, 가상계좌 등으로 다양해지면서 이러한 간극은 더 커진다. 보호자나 가족이 환자를 대신하여 진료비를 납부하면서 자신의 명의로 송금하는 경우, 금융기관이 제공하는 입금자명·입금일자·입금금액만으로는 HIS에 등록된 환자등록번호, </w:t>
+      </w:r>
+      <w:proofErr w:type="spellStart"/>
+      <w:r>
+        <w:rPr>
+          <w:lang w:eastAsia="ko-KR"/>
+        </w:rPr>
+        <w:t>환자명</w:t>
+      </w:r>
+      <w:proofErr w:type="spellEnd"/>
+      <w:r>
+        <w:rPr>
+          <w:lang w:eastAsia="ko-KR"/>
+        </w:rPr>
+        <w:t>, 진료비 정보를 자동으로 연결하기 어렵다. 결국 원무 담당자는 입금내역과 환자정보를 대조하여 해당 금액을 특정 환자의 진료비와 연결하는 확인 절차를 거쳐야 한다. 환자가 개명한 경우에도 과거 진료 당시의 성명과 현재 등록된 성명이 달라 유사한 문제가 발생한다.</w:t>
       </w:r>
     </w:p>
     <w:p>
@@ -301,7 +382,112 @@
         <w:rPr>
           <w:lang w:eastAsia="ko-KR"/>
         </w:rPr>
-        <w:t>또한 진료가 끝난 뒤 건강보험 급여비용 심사나 진료비 확인 결과 과다 납부가 확인되면 환불금이 발생하는데, 그 사이에 환자가 사망한 경우에는 본인에게 지급할 수 없으므로 상속인 등 적법한 수령권자를 별도로 확인해야 한다. 이 환불금은 환자의 재산에 해당하고 사망과 함께 상속재산이 되므로, 의료기관이 권한 없는 사람에게 지급하면 추후 분쟁이나 이중 지급의 위험을 부담한다. 반대로 수령권자 확인을 미루면 환불금이 장기간 미환급 상태로 유지된다. HIS는 환자의 진료와 원무정보를 관리하기 위한 시스템이므로, 사망 이후의 상속관계나 환불금 수령권자를 확인하는 기능은 제공하지 않는다. 실제 수령권자를 확인하려면 제적등본, 가족관계증명서 등 외부 행정기관의 공적 서류를 대조·검증하는 절차가 요구된다. EMR이 정보의 정확성과 기재 충실도를 높이는 데 기여한다는 점은 이미 확인되었으나(신아미 등, 2009), EMR이 기관 외부의 행정정보 확인을 대신하지는 못한다. 의료정보의 외부 활용은 개인정보 보호와 법적·제도적 장치를 전제로 해야 한다는 지적도 있다(김영은, 이지연, 2024; 이민영, 2011).</w:t>
+        <w:t xml:space="preserve">또한 진료가 끝난 뒤 건강보험 급여비용 심사나 진료비 확인 결과 과다 납부가 확인되면 환불금이 발생하는데, 그 사이에 환자가 사망한 경우에는 본인에게 지급할 수 없으므로 상속인 등 적법한 </w:t>
+      </w:r>
+      <w:proofErr w:type="spellStart"/>
+      <w:r>
+        <w:rPr>
+          <w:lang w:eastAsia="ko-KR"/>
+        </w:rPr>
+        <w:t>수령권자를</w:t>
+      </w:r>
+      <w:proofErr w:type="spellEnd"/>
+      <w:r>
+        <w:rPr>
+          <w:lang w:eastAsia="ko-KR"/>
+        </w:rPr>
+        <w:t xml:space="preserve"> 별도로 확인해야 한다. 이 환불금은 환자의 재산에 해당하고 사망과 함께 상속재산이 되므로, 의료기관이 권한 없는 사람에게 지급하면 추후 분쟁이나 이중 지급의 위험을 부담한다. 반대로 </w:t>
+      </w:r>
+      <w:proofErr w:type="spellStart"/>
+      <w:r>
+        <w:rPr>
+          <w:lang w:eastAsia="ko-KR"/>
+        </w:rPr>
+        <w:t>수령권자</w:t>
+      </w:r>
+      <w:proofErr w:type="spellEnd"/>
+      <w:r>
+        <w:rPr>
+          <w:lang w:eastAsia="ko-KR"/>
+        </w:rPr>
+        <w:t xml:space="preserve"> 확인을 미루면 환불금이 장기간 </w:t>
+      </w:r>
+      <w:proofErr w:type="spellStart"/>
+      <w:r>
+        <w:rPr>
+          <w:lang w:eastAsia="ko-KR"/>
+        </w:rPr>
+        <w:t>미환급</w:t>
+      </w:r>
+      <w:proofErr w:type="spellEnd"/>
+      <w:r>
+        <w:rPr>
+          <w:lang w:eastAsia="ko-KR"/>
+        </w:rPr>
+        <w:t xml:space="preserve"> 상태로 유지된다. HIS는 환자의 진료와 원무정보를 관리하기 위한 시스템이므로, 사망 이후의 상속관계나 </w:t>
+      </w:r>
+      <w:proofErr w:type="spellStart"/>
+      <w:r>
+        <w:rPr>
+          <w:lang w:eastAsia="ko-KR"/>
+        </w:rPr>
+        <w:t>환불금</w:t>
+      </w:r>
+      <w:proofErr w:type="spellEnd"/>
+      <w:r>
+        <w:rPr>
+          <w:lang w:eastAsia="ko-KR"/>
+        </w:rPr>
+        <w:t xml:space="preserve"> </w:t>
+      </w:r>
+      <w:proofErr w:type="spellStart"/>
+      <w:r>
+        <w:rPr>
+          <w:lang w:eastAsia="ko-KR"/>
+        </w:rPr>
+        <w:t>수령권자를</w:t>
+      </w:r>
+      <w:proofErr w:type="spellEnd"/>
+      <w:r>
+        <w:rPr>
+          <w:lang w:eastAsia="ko-KR"/>
+        </w:rPr>
+        <w:t xml:space="preserve"> 확인하는 기능은 제공하지 않는다. 실제 </w:t>
+      </w:r>
+      <w:proofErr w:type="spellStart"/>
+      <w:r>
+        <w:rPr>
+          <w:lang w:eastAsia="ko-KR"/>
+        </w:rPr>
+        <w:t>수령권자를</w:t>
+      </w:r>
+      <w:proofErr w:type="spellEnd"/>
+      <w:r>
+        <w:rPr>
+          <w:lang w:eastAsia="ko-KR"/>
+        </w:rPr>
+        <w:t xml:space="preserve"> 확인하려면 제적등본, 가족관계증명서 등 외부 행정기관의 공적 서류를 대조·검증하는 절차가 요구된다. EMR이 정보의 정확성과 기재 충실도를 높이는 데 기여한다는 점은 이미 확인되었으나(</w:t>
+      </w:r>
+      <w:proofErr w:type="spellStart"/>
+      <w:r>
+        <w:rPr>
+          <w:lang w:eastAsia="ko-KR"/>
+        </w:rPr>
+        <w:t>신아미</w:t>
+      </w:r>
+      <w:proofErr w:type="spellEnd"/>
+      <w:r>
+        <w:rPr>
+          <w:lang w:eastAsia="ko-KR"/>
+        </w:rPr>
+        <w:t xml:space="preserve"> 등, </w:t>
+      </w:r>
+      <w:r>
+        <w:rPr>
+          <w:lang w:eastAsia="ko-KR"/>
+        </w:rPr>
+        <w:lastRenderedPageBreak/>
+        <w:t>2009), EMR이 기관 외부의 행정정보 확인을 대신하지는 못한다. 의료정보의 외부 활용은 개인정보 보호와 법적·제도적 장치를 전제로 해야 한다는 지적도 있다(김영은, 이지연, 2024; 이민영, 2011).</w:t>
       </w:r>
     </w:p>
     <w:p>
@@ -333,7 +519,49 @@
         <w:rPr>
           <w:lang w:eastAsia="ko-KR"/>
         </w:rPr>
-        <w:t>기존 선행연구는 HIS의 사용성과 업무 효율성(박찬석 등, 2008), EMR의 정확성과 정보 일치성(신아미 등, 2009), 입원환자의 본인부담 구조(조영순, 2006), 원무관리 업무의 표준화(김진아 등, 2016) 등을 중심으로 이루어져 왔다. 그러나 진료비 정산 과정에서 남는 미식별 입금과 사망환자 미수령 환불금을 하나의 정보관리 대상으로 설정하고, HIS와 공공 행정정보의 연계 가능성을 다룬 선행연구는 제한적이다. 사망환자 환불금은 환자 재산권과 직결되므로, 병원은 환불 업무를 수행하는 데 그치지 않고 수령 권리자 확인과 이를 위한 행정 절차를 포함하는 관리체계를 마련할 필요가 있다.</w:t>
+        <w:t xml:space="preserve">기존 선행연구는 HIS의 사용성과 업무 효율성(박찬석 등, 2008), EMR의 정확성과 정보 </w:t>
+      </w:r>
+      <w:proofErr w:type="spellStart"/>
+      <w:r>
+        <w:rPr>
+          <w:lang w:eastAsia="ko-KR"/>
+        </w:rPr>
+        <w:t>일치성</w:t>
+      </w:r>
+      <w:proofErr w:type="spellEnd"/>
+      <w:r>
+        <w:rPr>
+          <w:lang w:eastAsia="ko-KR"/>
+        </w:rPr>
+        <w:t>(</w:t>
+      </w:r>
+      <w:proofErr w:type="spellStart"/>
+      <w:r>
+        <w:rPr>
+          <w:lang w:eastAsia="ko-KR"/>
+        </w:rPr>
+        <w:t>신아미</w:t>
+      </w:r>
+      <w:proofErr w:type="spellEnd"/>
+      <w:r>
+        <w:rPr>
+          <w:lang w:eastAsia="ko-KR"/>
+        </w:rPr>
+        <w:t xml:space="preserve"> 등, 2009), 입원환자의 본인부담 구조(</w:t>
+      </w:r>
+      <w:proofErr w:type="spellStart"/>
+      <w:r>
+        <w:rPr>
+          <w:lang w:eastAsia="ko-KR"/>
+        </w:rPr>
+        <w:t>조영순</w:t>
+      </w:r>
+      <w:proofErr w:type="spellEnd"/>
+      <w:r>
+        <w:rPr>
+          <w:lang w:eastAsia="ko-KR"/>
+        </w:rPr>
+        <w:t>, 2006), 원무관리 업무의 표준화(김진아 등, 2016) 등을 중심으로 이루어져 왔다. 그러나 진료비 정산 과정에서 남는 미식별 입금과 사망환자 미수령 환불금을 하나의 정보관리 대상으로 설정하고, HIS와 공공 행정정보의 연계 가능성을 다룬 선행연구는 제한적이다. 사망환자 환불금은 환자 재산권과 직결되므로, 병원은 환불 업무를 수행하는 데 그치지 않고 수령 권리자 확인과 이를 위한 행정 절차를 포함하는 관리체계를 마련할 필요가 있다.</w:t>
       </w:r>
     </w:p>
     <w:p>
@@ -349,7 +577,21 @@
         <w:rPr>
           <w:lang w:eastAsia="ko-KR"/>
         </w:rPr>
-        <w:t>이에 본 연구는 병원 원무행정에서 개별적으로 처리되어 온 예외적 정산정보를 체계적으로 관리하고, 환자의 재산권 보호와 의료행정의 투명성을 함께 확보할 수 있는 공공관리 방안을 제시하고자 한다. 진료비 정산 과정에서 발생하는 예외적 정보는 크게 세 가지로 수렴한다. 첫째는 미식별 입금에서 입금정보와 환자정보를 정확하게 매칭하는 문제이고, 둘째는 미수령 환불금에서 지급 여부와 처리상태를 지속적으로 추적하는 문제이며, 셋째는 사망환자의 환불금에서 적법한 수령권한을 확인하는 문제이다. 본 연구는 먼저 HIS와 건강보험, 사망, 상속 관련 행정정보의 연계 가능성을 검토하고, 이어 미식별 입금과 사망환자 미수령 환불금의 관리를 위한 정보연계 기반 정책모형을 제안한다. 나아가 권리자에게 환급하기 위한 절차를 모두 거친 뒤에도 끝내 수령되지 않는 금액의 종국 처리 방향까지 함께 검토한다. 이를 통해 미해결 진료비 관련 정보를 투명하게 추적하고, 환자와 상속인의 재산권을 보호하며 의료행정의 관리 공백을 줄이는 데 기여할 것으로 기대한다.</w:t>
+        <w:t xml:space="preserve">이에 본 연구는 병원 원무행정에서 개별적으로 처리되어 온 예외적 정산정보를 체계적으로 관리하고, 환자의 재산권 보호와 의료행정의 투명성을 함께 확보할 수 있는 공공관리 방안을 제시하고자 한다. 진료비 정산 과정에서 발생하는 예외적 정보는 크게 세 가지로 수렴한다. 첫째는 미식별 입금에서 입금정보와 환자정보를 정확하게 매칭하는 문제이고, 둘째는 미수령 환불금에서 지급 여부와 처리상태를 지속적으로 추적하는 문제이며, 셋째는 사망환자의 환불금에서 적법한 수령권한을 확인하는 문제이다. 본 연구는 먼저 HIS와 건강보험, 사망, 상속 관련 행정정보의 연계 가능성을 검토하고, 이어 미식별 입금과 사망환자 미수령 환불금의 관리를 위한 정보연계 기반 정책모형을 제안한다. 나아가 권리자에게 환급하기 위한 절차를 모두 거친 뒤에도 끝내 </w:t>
+      </w:r>
+      <w:proofErr w:type="spellStart"/>
+      <w:r>
+        <w:rPr>
+          <w:lang w:eastAsia="ko-KR"/>
+        </w:rPr>
+        <w:t>수령되지</w:t>
+      </w:r>
+      <w:proofErr w:type="spellEnd"/>
+      <w:r>
+        <w:rPr>
+          <w:lang w:eastAsia="ko-KR"/>
+        </w:rPr>
+        <w:t xml:space="preserve"> 않는 금액의 종국 처리 방향까지 함께 검토한다. 이를 통해 미해결 진료비 관련 정보를 투명하게 추적하고, 환자와 상속인의 재산권을 보호하며 의료행정의 관리 공백을 줄이는 데 기여할 것으로 기대한다.</w:t>
       </w:r>
     </w:p>
     <w:p>
@@ -367,6 +609,7 @@
           <w:sz w:val="26"/>
           <w:lang w:eastAsia="ko-KR"/>
         </w:rPr>
+        <w:lastRenderedPageBreak/>
         <w:t>Ⅱ. 이론적 고찰</w:t>
       </w:r>
     </w:p>
@@ -400,7 +643,35 @@
         <w:rPr>
           <w:lang w:eastAsia="ko-KR"/>
         </w:rPr>
-        <w:t>의료기관 원무행정은 환자 진료와 관련된 수납, 청구 및 각종 행정정보를 관리하는 업무이며, 진료정보와 비용정보의 연계가 중요하다. 박찬석 외(2008)는 HIS의 주요 업무영역에 진료비 수납 및 청구가 포함됨을 보였고, 김진아 외(2016)는 외래 원무관리 업무의 절차를 조사하여 접수·수납·제증명 등 업무의 표준화 필요성을 제기하였다. 조영순(2006)은 한 대학병원 산재보험 입원환자의 본인부담금을 분석하여 보험 및 진료 특성에 따라 본인부담금이 달라질 수 있음을 보고하였다. 진료비 정산은 단순한 수납 행위가 아니라 건강보험 급여기준, 환자 본인부담 구조, 심사 결과에 따라 금액이 확정되는 절차를 포함한다. 동일한 진료라도 보험 적용 여부와 심사 조정 결과에 따라 환자가 최종적으로 부담하는 금액이 달라지므로, 수납 시점의 금액이 확정 금액과 정확히 일치하지 않을 수 있으며, 이 차액이 환불 또는 추가 수납의 원인이 된다.</w:t>
+        <w:t>의료기관 원무행정은 환자 진료와 관련된 수납, 청구 및 각종 행정정보를 관리하는 업무이며, 진료정보와 비용정보의 연계가 중요하다. 박찬석 외(2008)는 HIS의 주요 업무영역에 진료비 수납 및 청구가 포함됨을 보였고, 김진아 외(2016)는 외래 원무관리 업무의 절차를 조사하여 접수·수납·</w:t>
+      </w:r>
+      <w:proofErr w:type="spellStart"/>
+      <w:r>
+        <w:rPr>
+          <w:lang w:eastAsia="ko-KR"/>
+        </w:rPr>
+        <w:t>제증명</w:t>
+      </w:r>
+      <w:proofErr w:type="spellEnd"/>
+      <w:r>
+        <w:rPr>
+          <w:lang w:eastAsia="ko-KR"/>
+        </w:rPr>
+        <w:t xml:space="preserve"> 등 업무의 표준화 필요성을 제기하였다. </w:t>
+      </w:r>
+      <w:proofErr w:type="spellStart"/>
+      <w:r>
+        <w:rPr>
+          <w:lang w:eastAsia="ko-KR"/>
+        </w:rPr>
+        <w:t>조영순</w:t>
+      </w:r>
+      <w:proofErr w:type="spellEnd"/>
+      <w:r>
+        <w:rPr>
+          <w:lang w:eastAsia="ko-KR"/>
+        </w:rPr>
+        <w:t>(2006)은 한 대학병원 산재보험 입원환자의 본인부담금을 분석하여 보험 및 진료 특성에 따라 본인부담금이 달라질 수 있음을 보고하였다. 진료비 정산은 단순한 수납 행위가 아니라 건강보험 급여기준, 환자 본인부담 구조, 심사 결과에 따라 금액이 확정되는 절차를 포함한다. 동일한 진료라도 보험 적용 여부와 심사 조정 결과에 따라 환자가 최종적으로 부담하는 금액이 달라지므로, 수납 시점의 금액이 확정 금액과 정확히 일치하지 않을 수 있으며, 이 차액이 환불 또는 추가 수납의 원인이 된다.</w:t>
       </w:r>
     </w:p>
     <w:p>
@@ -433,7 +704,49 @@
         <w:rPr>
           <w:lang w:eastAsia="ko-KR"/>
         </w:rPr>
-        <w:t>건강보험 진료비는 관련 급여기준과 심사절차에 따라 산정·청구되며, 심사 또는 진료비 확인 결과에 따라 환자가 부담한 금액이 조정되거나 환불될 수 있다. 진료비의 삭감 또는 조정에는 의료기관의 진료 및 운영 특성 등 다양한 요인이 작용한다. 양유정(2012)은 의료기관의 운영요인과 환경요인이 진료비 삭감률에 미치는 영향을 분석하여, 의료기관의 규모와 운영 효율성이 높을수록 삭감률이 낮아지는 경향을 보고하였다. 건강보험 심사 과정에서 생기는 진료비 삭감과 조정은 환자 부담금의 변동으로 이어지고, 그 결과 과다 납부된 진료비에 대한 환불 절차가 발생한다.</w:t>
+        <w:t xml:space="preserve">건강보험 진료비는 관련 급여기준과 심사절차에 따라 산정·청구되며, 심사 또는 진료비 확인 결과에 따라 환자가 부담한 금액이 조정되거나 환불될 수 있다. 진료비의 삭감 또는 조정에는 의료기관의 진료 및 운영 특성 등 다양한 요인이 작용한다. </w:t>
+      </w:r>
+      <w:proofErr w:type="spellStart"/>
+      <w:r>
+        <w:rPr>
+          <w:lang w:eastAsia="ko-KR"/>
+        </w:rPr>
+        <w:t>양유정</w:t>
+      </w:r>
+      <w:proofErr w:type="spellEnd"/>
+      <w:r>
+        <w:rPr>
+          <w:lang w:eastAsia="ko-KR"/>
+        </w:rPr>
+        <w:t xml:space="preserve">(2012)은 의료기관의 운영요인과 환경요인이 진료비 </w:t>
+      </w:r>
+      <w:proofErr w:type="spellStart"/>
+      <w:r>
+        <w:rPr>
+          <w:lang w:eastAsia="ko-KR"/>
+        </w:rPr>
+        <w:t>삭감률에</w:t>
+      </w:r>
+      <w:proofErr w:type="spellEnd"/>
+      <w:r>
+        <w:rPr>
+          <w:lang w:eastAsia="ko-KR"/>
+        </w:rPr>
+        <w:t xml:space="preserve"> 미치는 영향을 분석하여, 의료기관의 규모와 운영 효율성이 높을수록 </w:t>
+      </w:r>
+      <w:proofErr w:type="spellStart"/>
+      <w:r>
+        <w:rPr>
+          <w:lang w:eastAsia="ko-KR"/>
+        </w:rPr>
+        <w:t>삭감률이</w:t>
+      </w:r>
+      <w:proofErr w:type="spellEnd"/>
+      <w:r>
+        <w:rPr>
+          <w:lang w:eastAsia="ko-KR"/>
+        </w:rPr>
+        <w:t xml:space="preserve"> 낮아지는 경향을 보고하였다. 건강보험 심사 과정에서 생기는 진료비 삭감과 조정은 환자 부담금의 변동으로 이어지고, 그 결과 과다 납부된 진료비에 대한 환불 절차가 발생한다.</w:t>
       </w:r>
     </w:p>
     <w:p>
@@ -454,18 +767,39 @@
     </w:p>
     <w:p>
       <w:pPr>
-        <w:spacing w:before="200" w:after="100"/>
-        <w:rPr>
-          <w:lang w:eastAsia="ko-KR"/>
-        </w:rPr>
-      </w:pPr>
-      <w:r>
+        <w:spacing w:after="200" w:line="276" w:lineRule="auto"/>
         <w:rPr>
           <w:rFonts w:ascii="맑은 고딕" w:eastAsia="맑은 고딕" w:hAnsi="맑은 고딕"/>
           <w:b/>
           <w:sz w:val="23"/>
           <w:lang w:eastAsia="ko-KR"/>
         </w:rPr>
+      </w:pPr>
+      <w:r>
+        <w:rPr>
+          <w:rFonts w:ascii="맑은 고딕" w:eastAsia="맑은 고딕" w:hAnsi="맑은 고딕"/>
+          <w:b/>
+          <w:sz w:val="23"/>
+          <w:lang w:eastAsia="ko-KR"/>
+        </w:rPr>
+        <w:br w:type="page"/>
+      </w:r>
+    </w:p>
+    <w:p>
+      <w:pPr>
+        <w:spacing w:before="200" w:after="100"/>
+        <w:rPr>
+          <w:lang w:eastAsia="ko-KR"/>
+        </w:rPr>
+      </w:pPr>
+      <w:r>
+        <w:rPr>
+          <w:rFonts w:ascii="맑은 고딕" w:eastAsia="맑은 고딕" w:hAnsi="맑은 고딕"/>
+          <w:b/>
+          <w:sz w:val="23"/>
+          <w:lang w:eastAsia="ko-KR"/>
+        </w:rPr>
+        <w:lastRenderedPageBreak/>
         <w:t>3. HIS와 환자정보 관리</w:t>
       </w:r>
     </w:p>
@@ -482,7 +816,49 @@
         <w:rPr>
           <w:lang w:eastAsia="ko-KR"/>
         </w:rPr>
-        <w:t>HIS는 의료기관의 진료 및 행정업무에서 생성되는 정보를 전산화하여 관리하는 정보시스템이며, EMR은 환자의 진료 관련 기록을 전자적으로 작성·관리하는 체계이다. 신아미 외(2009)는 종이의무기록과 전자의무기록의 기재정도 및 일치도를 비교하였고, 이주연 외(2013)는 대형 대학병원의 의무기록관리 과정에서 서식과 용어의 표준화, 시스템 간 연계와 관련된 문제를 지적하였다. 이 연구들은 병원정보의 전산화와 함께 정보의 일관성과 표준화가 중요함을 시사한다. 박찬석 외(2008)는 HIS의 품질 평가에서 외부 기관과의 정보공유 및 표준화가 개선이 필요한 영역으로 나타났다고 하였으며, 김영은과 이지연(2024)은 EMR 공유와 관련하여 개인정보 보호와 법·제도적 기반의 중요성을 강조하였다. 따라서 병원정보를 외부 행정정보와 연계할 때에는 정보의 목적과 범위를 명확히 하고 개인정보 보호 및 접근권한을 함께 고려해야 한다.</w:t>
+        <w:t xml:space="preserve">HIS는 의료기관의 진료 및 행정업무에서 생성되는 정보를 전산화하여 관리하는 </w:t>
+      </w:r>
+      <w:proofErr w:type="spellStart"/>
+      <w:r>
+        <w:rPr>
+          <w:lang w:eastAsia="ko-KR"/>
+        </w:rPr>
+        <w:t>정보시스템이며</w:t>
+      </w:r>
+      <w:proofErr w:type="spellEnd"/>
+      <w:r>
+        <w:rPr>
+          <w:lang w:eastAsia="ko-KR"/>
+        </w:rPr>
+        <w:t xml:space="preserve">, EMR은 환자의 진료 관련 기록을 전자적으로 작성·관리하는 체계이다. </w:t>
+      </w:r>
+      <w:proofErr w:type="spellStart"/>
+      <w:r>
+        <w:rPr>
+          <w:lang w:eastAsia="ko-KR"/>
+        </w:rPr>
+        <w:t>신아미</w:t>
+      </w:r>
+      <w:proofErr w:type="spellEnd"/>
+      <w:r>
+        <w:rPr>
+          <w:lang w:eastAsia="ko-KR"/>
+        </w:rPr>
+        <w:t xml:space="preserve"> 외(2009)는 종이의무기록과 전자의무기록의 기재정도 및 일치도를 비교하였고, 이주연 외(2013)는 대형 대학병원의 의무기록관리 과정에서 서식과 용어의 표준화, 시스템 간 연계와 관련된 문제를 지적하였다. 이 연구들은 병원정보의 전산화와 함께 정보의 일관성과 표준화가 중요함을 시사한다. 박찬석 외(2008)는 HIS의 품질 평가에서 외부 기관과의 정보공유 및 표준화가 개선이 필요한 영역으로 나타났다고 하였으며, </w:t>
+      </w:r>
+      <w:proofErr w:type="spellStart"/>
+      <w:r>
+        <w:rPr>
+          <w:lang w:eastAsia="ko-KR"/>
+        </w:rPr>
+        <w:t>김영은과</w:t>
+      </w:r>
+      <w:proofErr w:type="spellEnd"/>
+      <w:r>
+        <w:rPr>
+          <w:lang w:eastAsia="ko-KR"/>
+        </w:rPr>
+        <w:t xml:space="preserve"> 이지연(2024)은 EMR 공유와 관련하여 개인정보 보호와 법·제도적 기반의 중요성을 강조하였다. 따라서 병원정보를 외부 행정정보와 연계할 때에는 정보의 목적과 범위를 명확히 하고 개인정보 보호 및 접근권한을 함께 고려해야 한다.</w:t>
       </w:r>
     </w:p>
     <w:p>
@@ -515,7 +891,49 @@
         <w:rPr>
           <w:lang w:eastAsia="ko-KR"/>
         </w:rPr>
-        <w:t>미식별 입금과 미수령 환불금을 처리할 때에는 사법상 권리관계와 공법상 행정절차가 함께 걸려 있으므로, 관련 법제를 먼저 확인할 필요가 있다. 환자가 납부한 진료비 가운데 과다 수납된 금액은 의료기관이 환자에게 반환해야 한다. 환자가 사망하면 이 반환청구권은 상속재산으로서 상속인에게 승계되며, 상속인이 여럿이면 지급 대상과 절차가 더 복잡해진다(민법 제1005조, 제1006조). 수령권자를 특정할 수 없거나 수령을 거절·회피하는 경우에는 변제공탁으로 채무를 면하는 방법도 있으나(민법 제487조), 소액의 환불금마다 공탁 절차(공탁법 제4조)를 거치는 것은 의료기관에 상당한 업무 부담이 되어 현실적으로 활용되기 어렵다.</w:t>
+        <w:t xml:space="preserve">미식별 입금과 미수령 환불금을 처리할 때에는 사법상 권리관계와 공법상 행정절차가 함께 걸려 있으므로, 관련 법제를 먼저 확인할 필요가 있다. 환자가 납부한 진료비 가운데 과다 수납된 금액은 의료기관이 환자에게 반환해야 한다. 환자가 사망하면 이 반환청구권은 상속재산으로서 상속인에게 승계되며, 상속인이 여럿이면 지급 대상과 절차가 더 </w:t>
+      </w:r>
+      <w:proofErr w:type="spellStart"/>
+      <w:r>
+        <w:rPr>
+          <w:lang w:eastAsia="ko-KR"/>
+        </w:rPr>
+        <w:t>복잡해진다</w:t>
+      </w:r>
+      <w:proofErr w:type="spellEnd"/>
+      <w:r>
+        <w:rPr>
+          <w:lang w:eastAsia="ko-KR"/>
+        </w:rPr>
+        <w:t xml:space="preserve">(민법 제1005조, 제1006조). </w:t>
+      </w:r>
+      <w:proofErr w:type="spellStart"/>
+      <w:r>
+        <w:rPr>
+          <w:lang w:eastAsia="ko-KR"/>
+        </w:rPr>
+        <w:t>수령권자를</w:t>
+      </w:r>
+      <w:proofErr w:type="spellEnd"/>
+      <w:r>
+        <w:rPr>
+          <w:lang w:eastAsia="ko-KR"/>
+        </w:rPr>
+        <w:t xml:space="preserve"> 특정할 수 없거나 수령을 거절·회피하는 경우에는 </w:t>
+      </w:r>
+      <w:proofErr w:type="spellStart"/>
+      <w:r>
+        <w:rPr>
+          <w:lang w:eastAsia="ko-KR"/>
+        </w:rPr>
+        <w:t>변제공탁으로</w:t>
+      </w:r>
+      <w:proofErr w:type="spellEnd"/>
+      <w:r>
+        <w:rPr>
+          <w:lang w:eastAsia="ko-KR"/>
+        </w:rPr>
+        <w:t xml:space="preserve"> 채무를 면하는 방법도 있으나(민법 제487조), 소액의 환불금마다 공탁 절차(공탁법 제4조)를 거치는 것은 의료기관에 상당한 업무 부담이 되어 현실적으로 활용되기 어렵다.</w:t>
       </w:r>
     </w:p>
     <w:p>
@@ -547,7 +965,22 @@
         <w:rPr>
           <w:lang w:eastAsia="ko-KR"/>
         </w:rPr>
-        <w:t>미수령 금액의 공공적 관리에는 이미 유사한 선례가 있다. 국세 환급금 조회서비스, 휴면예금 및 숨은 금융재산 통합조회, 카드 포인트 통합조회 등은 개인이 존재를 알지 못하는 금전적 권리를 공공이 대신 찾아주는 방식으로 운영되어 왔다. '사망자 및 피후견인 등 재산조회 통합처리(안심상속)'도 같은 흐름에 있는 서비스로, 상속인이 여러 기관을 일일이 거치지 않고 사망자의 금융·부동산·세금·연금 정보를 한 번의 신청으로 조회할 수 있게 한다. 그러나 국민건강보험공단이 지급하는 공적 환급금과 달리, 개별 의료기관에서 직접 발생한 진료비 과오납금 및 미환급금은 이러한 공공 통합조회 대상에 포함되어 있지 않다. 이로 인해 상속인이 해당 병원에 개별적으로 문의하거나 방문하지 않는 한 환급금의 존재 여부조차 파악하기 어려운 행정적 사각지대가 발생한다. 의료기관의 미수령 환불금은 제도적 성격이 이와 유사하므로, 이들 선례는 본 연구의 제안을 설계하는 데 참고가 된다.</w:t>
+        <w:lastRenderedPageBreak/>
+        <w:t xml:space="preserve">미수령 금액의 공공적 관리에는 이미 유사한 선례가 있다. 국세 </w:t>
+      </w:r>
+      <w:proofErr w:type="spellStart"/>
+      <w:r>
+        <w:rPr>
+          <w:lang w:eastAsia="ko-KR"/>
+        </w:rPr>
+        <w:t>환급금</w:t>
+      </w:r>
+      <w:proofErr w:type="spellEnd"/>
+      <w:r>
+        <w:rPr>
+          <w:lang w:eastAsia="ko-KR"/>
+        </w:rPr>
+        <w:t xml:space="preserve"> 조회서비스, 휴면예금 및 숨은 금융재산 통합조회, 카드 포인트 통합조회 등은 개인이 존재를 알지 못하는 금전적 권리를 공공이 대신 찾아주는 방식으로 운영되어 왔다. '사망자 및 피후견인 등 재산조회 통합처리(안심상속)'도 같은 흐름에 있는 서비스로, 상속인이 여러 기관을 일일이 거치지 않고 사망자의 금융·부동산·세금·연금 정보를 한 번의 신청으로 조회할 수 있게 한다. 그러나 국민건강보험공단이 지급하는 공적 환급금과 달리, 개별 의료기관에서 직접 발생한 진료비 과오납금 및 미환급금은 이러한 공공 통합조회 대상에 포함되어 있지 않다. 이로 인해 상속인이 해당 병원에 개별적으로 문의하거나 방문하지 않는 한 환급금의 존재 여부조차 파악하기 어려운 행정적 사각지대가 발생한다. 의료기관의 미수령 환불금은 제도적 성격이 이와 유사하므로, 이들 선례는 본 연구의 제안을 설계하는 데 참고가 된다.</w:t>
       </w:r>
     </w:p>
     <w:p>
@@ -628,7 +1061,21 @@
         <w:rPr>
           <w:lang w:eastAsia="ko-KR"/>
         </w:rPr>
-        <w:t>진료비 정산 과정에서는 입금자와 실제 진료를 받은 환자의 명의가 다른 경우처럼 입금정보와 환자정보가 즉시 연결되지 않는 상황이 생길 수 있다. 본 연구에서는 입금 사실은 확인되었으나 해당 금액을 어느 환자의 진료비에 귀속시켜야 하는지가 즉시 확정되지 않은 상태를 '미식별 입금'으로 정의한다. 이러한 정보 불일치는 입금자명과 환자명이 다른 경우에만 생기는 것이 아니다. 환자의 개명 등으로 현재 병원에 등록된 성명과 금융거래 또는 과거 진료 과정에서 확인되는 성명이 달라지는 경우에도 동일 환자 여부를 추가로 확인해야 한다. 환자 식별을 성명 하나에만 의존하면 예외적 정산정보의 정확한 매칭에 한계가 생긴다.</w:t>
+        <w:t>진료비 정산 과정에서는 입금자와 실제 진료를 받은 환자의 명의가 다른 경우처럼 입금정보와 환자정보가 즉시 연결되지 않는 상황이 생길 수 있다. 본 연구에서는 입금 사실은 확인되었으나 해당 금액을 어느 환자의 진료비에 귀속시켜야 하는지가 즉시 확정되지 않은 상태를 '미식별 입금'</w:t>
+      </w:r>
+      <w:proofErr w:type="spellStart"/>
+      <w:r>
+        <w:rPr>
+          <w:lang w:eastAsia="ko-KR"/>
+        </w:rPr>
+        <w:t>으로</w:t>
+      </w:r>
+      <w:proofErr w:type="spellEnd"/>
+      <w:r>
+        <w:rPr>
+          <w:lang w:eastAsia="ko-KR"/>
+        </w:rPr>
+        <w:t xml:space="preserve"> 정의한다. 이러한 정보 불일치는 입금자명과 환자명이 다른 경우에만 생기는 것이 아니다. 환자의 개명 등으로 현재 병원에 등록된 성명과 금융거래 또는 과거 진료 과정에서 확인되는 성명이 달라지는 경우에도 동일 환자 여부를 추가로 확인해야 한다. 환자 식별을 성명 하나에만 의존하면 예외적 정산정보의 정확한 매칭에 한계가 생긴다.</w:t>
       </w:r>
     </w:p>
     <w:p>
@@ -644,7 +1091,22 @@
         <w:rPr>
           <w:lang w:eastAsia="ko-KR"/>
         </w:rPr>
-        <w:t>환불금이 발생하였으나 실제 지급이 완료되지 않으면 미수령 환불금으로 남는다. 특히 환불금 발생 이후 환자가 사망한 경우에는 생존 환자와 달리 실제 수령권한을 별도로 확인해야 하는 문제가 생긴다. 가족관계 변화나 이혼 등으로 기존 가족관계 또는 보호자 정보만으로는 현재 법적 관계와 수령권한을 판단하기 어려운 경우 추가적인 확인절차가 필요하다. 이러한 예외적 정산정보는 발생 원인에 따라 다음과 같이 정리할 수 있다.</w:t>
+        <w:lastRenderedPageBreak/>
+        <w:t xml:space="preserve">환불금이 발생하였으나 실제 지급이 완료되지 않으면 미수령 환불금으로 남는다. 특히 </w:t>
+      </w:r>
+      <w:proofErr w:type="spellStart"/>
+      <w:r>
+        <w:rPr>
+          <w:lang w:eastAsia="ko-KR"/>
+        </w:rPr>
+        <w:t>환불금</w:t>
+      </w:r>
+      <w:proofErr w:type="spellEnd"/>
+      <w:r>
+        <w:rPr>
+          <w:lang w:eastAsia="ko-KR"/>
+        </w:rPr>
+        <w:t xml:space="preserve"> 발생 이후 환자가 사망한 경우에는 생존 환자와 달리 실제 수령권한을 별도로 확인해야 하는 문제가 생긴다. 가족관계 변화나 이혼 등으로 기존 가족관계 또는 보호자 정보만으로는 현재 법적 관계와 수령권한을 판단하기 어려운 경우 추가적인 확인절차가 필요하다. 이러한 예외적 정산정보는 발생 원인에 따라 다음과 같이 정리할 수 있다.</w:t>
       </w:r>
     </w:p>
     <w:p>
@@ -659,7 +1121,21 @@
         <w:rPr>
           <w:lang w:eastAsia="ko-KR"/>
         </w:rPr>
-        <w:t>· 미식별 입금: 보호자·가족·법인 등이 대납하여 입금자 명의와 환자 명의가 다른 경우, 환자 개명으로 과거 정보와 현재 정보가 달라진 경우, 중복 입금이나 분할 입금으로 귀속이 불분명한 경우</w:t>
+        <w:t xml:space="preserve">· 미식별 입금: 보호자·가족·법인 등이 대납하여 </w:t>
+      </w:r>
+      <w:proofErr w:type="spellStart"/>
+      <w:r>
+        <w:rPr>
+          <w:lang w:eastAsia="ko-KR"/>
+        </w:rPr>
+        <w:t>입금자</w:t>
+      </w:r>
+      <w:proofErr w:type="spellEnd"/>
+      <w:r>
+        <w:rPr>
+          <w:lang w:eastAsia="ko-KR"/>
+        </w:rPr>
+        <w:t xml:space="preserve"> 명의와 환자 명의가 다른 경우, 환자 개명으로 과거 정보와 현재 정보가 달라진 경우, 중복 입금이나 분할 입금으로 귀속이 불분명한 경우</w:t>
       </w:r>
     </w:p>
     <w:p>
@@ -674,7 +1150,35 @@
         <w:rPr>
           <w:lang w:eastAsia="ko-KR"/>
         </w:rPr>
-        <w:t>· 미수령 환불금: 환자의 사망으로 수령권자가 불분명한 경우, 연락처 변경이나 이사 등으로 환자와 연락이 닿지 않는 경우, 금액이 소액이거나 안내가 미비하여 수령이 이루어지지 않는 경우</w:t>
+        <w:t xml:space="preserve">· 미수령 </w:t>
+      </w:r>
+      <w:proofErr w:type="spellStart"/>
+      <w:r>
+        <w:rPr>
+          <w:lang w:eastAsia="ko-KR"/>
+        </w:rPr>
+        <w:t>환불금</w:t>
+      </w:r>
+      <w:proofErr w:type="spellEnd"/>
+      <w:r>
+        <w:rPr>
+          <w:lang w:eastAsia="ko-KR"/>
+        </w:rPr>
+        <w:t xml:space="preserve">: 환자의 사망으로 </w:t>
+      </w:r>
+      <w:proofErr w:type="spellStart"/>
+      <w:r>
+        <w:rPr>
+          <w:lang w:eastAsia="ko-KR"/>
+        </w:rPr>
+        <w:t>수령권자가</w:t>
+      </w:r>
+      <w:proofErr w:type="spellEnd"/>
+      <w:r>
+        <w:rPr>
+          <w:lang w:eastAsia="ko-KR"/>
+        </w:rPr>
+        <w:t xml:space="preserve"> 불분명한 경우, 연락처 변경이나 이사 등으로 환자와 연락이 닿지 않는 경우, 금액이 소액이거나 안내가 미비하여 수령이 이루어지지 않는 경우</w:t>
       </w:r>
     </w:p>
     <w:p>
@@ -725,7 +1229,77 @@
         <w:rPr>
           <w:lang w:eastAsia="ko-KR"/>
         </w:rPr>
-        <w:t>본 연구의 분석 대상 자료는 세 범주로 구성된다. 첫째는 선행연구로, HIS의 사용성(박찬석 등, 2008), 원무관리 표준화(김진아 등, 2016), EMR의 기재정도 및 일치도(신아미 등, 2009), 입원환자의 본인부담금(조영순, 2006), 재원일과 비용(김상미 등, 2013), 진료비 삭감률(양유정, 2012), 의무기록관리(이주연 등, 2013), EMR 공유 의도(김영은, 이지연, 2024), 행정정보 활용과 개인정보 보호(이민영, 2011)를 포함한다. 둘째는 법령으로, 국민건강보험법 및 같은 법 시행령, 개인정보 보호법 제18조, 민법 제487조·제1005조·제1006조, 공탁법 제4조, 전자정부법 제36조·제37조, 가족관계의 등록 등에 관한 법률을 검토하였다. 셋째는 현행 행정서비스로, 정부24가 운영하는 '사망자 및 피후견인 등 재산조회 통합처리(안심상속)', 건강보험심사평가원의 진료비 확인 제도, 금융위원회·금융감독원의 휴면예금·숨은 금융자산 통합조회(파인), 행정안전부의 행정정보 공동이용을 검토 대상으로 하였다.</w:t>
+        <w:t>본 연구의 분석 대상 자료는 세 범주로 구성된다. 첫째는 선행연구로, HIS의 사용성(박찬석 등, 2008), 원무관리 표준화(김진아 등, 2016), EMR의 기재정도 및 일치도(</w:t>
+      </w:r>
+      <w:proofErr w:type="spellStart"/>
+      <w:r>
+        <w:rPr>
+          <w:lang w:eastAsia="ko-KR"/>
+        </w:rPr>
+        <w:t>신아미</w:t>
+      </w:r>
+      <w:proofErr w:type="spellEnd"/>
+      <w:r>
+        <w:rPr>
+          <w:lang w:eastAsia="ko-KR"/>
+        </w:rPr>
+        <w:t xml:space="preserve"> 등, 2009), 입원환자의 본인부담금(</w:t>
+      </w:r>
+      <w:proofErr w:type="spellStart"/>
+      <w:r>
+        <w:rPr>
+          <w:lang w:eastAsia="ko-KR"/>
+        </w:rPr>
+        <w:t>조영순</w:t>
+      </w:r>
+      <w:proofErr w:type="spellEnd"/>
+      <w:r>
+        <w:rPr>
+          <w:lang w:eastAsia="ko-KR"/>
+        </w:rPr>
+        <w:t>, 2006), 재원일과 비용(</w:t>
+      </w:r>
+      <w:proofErr w:type="spellStart"/>
+      <w:r>
+        <w:rPr>
+          <w:lang w:eastAsia="ko-KR"/>
+        </w:rPr>
+        <w:t>김상미</w:t>
+      </w:r>
+      <w:proofErr w:type="spellEnd"/>
+      <w:r>
+        <w:rPr>
+          <w:lang w:eastAsia="ko-KR"/>
+        </w:rPr>
+        <w:t xml:space="preserve"> 등, 2013), 진료비 </w:t>
+      </w:r>
+      <w:proofErr w:type="spellStart"/>
+      <w:r>
+        <w:rPr>
+          <w:lang w:eastAsia="ko-KR"/>
+        </w:rPr>
+        <w:t>삭감률</w:t>
+      </w:r>
+      <w:proofErr w:type="spellEnd"/>
+      <w:r>
+        <w:rPr>
+          <w:lang w:eastAsia="ko-KR"/>
+        </w:rPr>
+        <w:t>(</w:t>
+      </w:r>
+      <w:proofErr w:type="spellStart"/>
+      <w:r>
+        <w:rPr>
+          <w:lang w:eastAsia="ko-KR"/>
+        </w:rPr>
+        <w:t>양유정</w:t>
+      </w:r>
+      <w:proofErr w:type="spellEnd"/>
+      <w:r>
+        <w:rPr>
+          <w:lang w:eastAsia="ko-KR"/>
+        </w:rPr>
+        <w:t>, 2012), 의무기록관리(이주연 등, 2013), EMR 공유 의도(김영은, 이지연, 2024), 행정정보 활용과 개인정보 보호(이민영, 2011)를 포함한다. 둘째는 법령으로, 국민건강보험법 및 같은 법 시행령, 개인정보 보호법 제18조, 민법 제487조·제1005조·제1006조, 공탁법 제4조, 전자정부법 제36조·제37조, 가족관계의 등록 등에 관한 법률을 검토하였다. 셋째는 현행 행정서비스로, 정부24가 운영하는 '사망자 및 피후견인 등 재산조회 통합처리(안심상속)', 건강보험심사평가원의 진료비 확인 제도, 금융위원회·금융감독원의 휴면예금·숨은 금융자산 통합조회(파인), 행정안전부의 행정정보 공동이용을 검토 대상으로 하였다.</w:t>
       </w:r>
     </w:p>
     <w:p>
@@ -758,6 +1332,7 @@
           <w:sz w:val="23"/>
           <w:lang w:eastAsia="ko-KR"/>
         </w:rPr>
+        <w:lastRenderedPageBreak/>
         <w:t>2. 연구 방법 및 분석 절차</w:t>
       </w:r>
     </w:p>
@@ -808,7 +1383,21 @@
         <w:rPr>
           <w:lang w:eastAsia="ko-KR"/>
         </w:rPr>
-        <w:t>Ⅱ장과 Ⅲ장에서 검토한 결과, 진료비 정산 과정에서 나타나는 예외적 정산정보는 (1) 입금정보와 환자정보의 매칭, (2) 미수령 환불금의 지급상태 추적, (3) 사망환자의 수령권한 확인이라는 세 가지 관리 문제로 수렴하였다. 본 연구는 서론에서 제시한 목적에 따라 먼저 공공행정정보와의 연계 가능성을 검토한 뒤, 이를 전제로 한 단계적 관리모형을 제시한다. 이는 박찬석 외(2008)가 HIS 품질 평가에서 외부 기관과의 정보공유 및 표준화를 개선이 필요한 영역으로 지적한 점과도 일치한다.</w:t>
+        <w:t xml:space="preserve">Ⅱ장과 Ⅲ장에서 검토한 결과, 진료비 정산 과정에서 나타나는 예외적 정산정보는 (1) 입금정보와 환자정보의 매칭, (2) 미수령 환불금의 지급상태 추적, (3) 사망환자의 수령권한 확인이라는 세 가지 관리 문제로 수렴하였다. 본 연구는 서론에서 제시한 목적에 따라 먼저 공공행정정보와의 연계 가능성을 검토한 뒤, 이를 전제로 한 단계적 관리모형을 제시한다. 이는 박찬석 외(2008)가 HIS 품질 평가에서 외부 기관과의 정보공유 및 표준화를 개선이 필요한 영역으로 지적한 </w:t>
+      </w:r>
+      <w:proofErr w:type="spellStart"/>
+      <w:r>
+        <w:rPr>
+          <w:lang w:eastAsia="ko-KR"/>
+        </w:rPr>
+        <w:t>점과도</w:t>
+      </w:r>
+      <w:proofErr w:type="spellEnd"/>
+      <w:r>
+        <w:rPr>
+          <w:lang w:eastAsia="ko-KR"/>
+        </w:rPr>
+        <w:t xml:space="preserve"> 일치한다.</w:t>
       </w:r>
     </w:p>
     <w:p>
@@ -857,7 +1446,21 @@
         <w:rPr>
           <w:lang w:eastAsia="ko-KR"/>
         </w:rPr>
-        <w:t>첫째, 정산정보의 정확한 식별 원칙이다. 입금자명이나 환자명 같은 단일 정보에 의존하지 않고, 필요한 경우 환자번호, 생년월일, 진료기간 등 의료기관이 적법하게 보유·활용할 수 있는 식별정보를 종합하여 동일인 여부를 확인한다.</w:t>
+        <w:t xml:space="preserve">첫째, 정산정보의 정확한 식별 원칙이다. 입금자명이나 </w:t>
+      </w:r>
+      <w:proofErr w:type="spellStart"/>
+      <w:r>
+        <w:rPr>
+          <w:lang w:eastAsia="ko-KR"/>
+        </w:rPr>
+        <w:t>환자명</w:t>
+      </w:r>
+      <w:proofErr w:type="spellEnd"/>
+      <w:r>
+        <w:rPr>
+          <w:lang w:eastAsia="ko-KR"/>
+        </w:rPr>
+        <w:t xml:space="preserve"> 같은 단일 정보에 의존하지 않고, 필요한 경우 환자번호, 생년월일, 진료기간 등 의료기관이 적법하게 보유·활용할 수 있는 식별정보를 종합하여 동일인 여부를 확인한다.</w:t>
       </w:r>
     </w:p>
     <w:p>
@@ -889,6 +1492,7 @@
         <w:rPr>
           <w:lang w:eastAsia="ko-KR"/>
         </w:rPr>
+        <w:lastRenderedPageBreak/>
         <w:t>셋째, 단계적 처리의 원칙이다. 미식별 입금이나 환불금이 발생했다는 이유만으로 외부정보를 즉시 조회하지 않고, 의료기관 내부에서 먼저 확인한 뒤 내부정보만으로 해결이 어려운 경우에 한하여 추가적인 연계 필요성을 검토한다.</w:t>
       </w:r>
     </w:p>
@@ -970,7 +1574,21 @@
         <w:rPr>
           <w:lang w:eastAsia="ko-KR"/>
         </w:rPr>
-        <w:t>현재 정부24의 '사망자 및 피후견인 등 재산조회 통합처리(안심상속)'는 상속인 또는 후견인이 사망자의 금융내역, 토지, 자동차, 세금, 연금가입 여부 등의 재산 관련 정보를 통합적으로 조회 신청할 수 있도록 하는 행정서비스이다. 신청인이 한 번 신청하면 각 기관이 보유한 정보를 개별적으로 회신하는 구조이므로, 여러 기관을 일일이 거치는 부담을 줄여 준다. 앞서 살펴본 국세 환급금, 휴면예금, 카드 포인트 등 개인이 찾아가지 않은 금액을 공공이 조회해 주는 서비스도 이미 운영되고 있다. 그러나 현재 공개된 서비스 범위에 의료기관의 미수령 환불금이 별도의 조회대상으로 포함되어 있지는 않다.</w:t>
+        <w:t xml:space="preserve">현재 정부24의 '사망자 및 피후견인 등 재산조회 통합처리(안심상속)'는 상속인 또는 후견인이 사망자의 금융내역, 토지, 자동차, 세금, 연금가입 여부 등의 재산 관련 정보를 통합적으로 조회 신청할 수 있도록 하는 행정서비스이다. 신청인이 한 번 신청하면 각 기관이 보유한 정보를 개별적으로 회신하는 구조이므로, 여러 기관을 일일이 거치는 부담을 줄여 준다. 앞서 살펴본 국세 </w:t>
+      </w:r>
+      <w:proofErr w:type="spellStart"/>
+      <w:r>
+        <w:rPr>
+          <w:lang w:eastAsia="ko-KR"/>
+        </w:rPr>
+        <w:t>환급금</w:t>
+      </w:r>
+      <w:proofErr w:type="spellEnd"/>
+      <w:r>
+        <w:rPr>
+          <w:lang w:eastAsia="ko-KR"/>
+        </w:rPr>
+        <w:t>, 휴면예금, 카드 포인트 등 개인이 찾아가지 않은 금액을 공공이 조회해 주는 서비스도 이미 운영되고 있다. 그러나 현재 공개된 서비스 범위에 의료기관의 미수령 환불금이 별도의 조회대상으로 포함되어 있지는 않다.</w:t>
       </w:r>
     </w:p>
     <w:p>
@@ -1018,7 +1636,22 @@
         <w:rPr>
           <w:lang w:eastAsia="ko-KR"/>
         </w:rPr>
-        <w:t>제도적 측면에서는 국세 환급금, 휴면예금·숨은 금융재산, 카드 포인트 통합조회와 '사망자 등 재산조회 통합처리(안심상속)'처럼 개인이 알지 못하는 금전적 권리를 공공이 대신 조회해 주는 선례가 이미 운영되고 있다. 그러나 의료기관의 미수령 환불금은 현재 이들 조회대상에 포함되어 있지 않아 기존 제도에 자동으로 편입되는 구조는 아니다. 다만 이는 기존 조회체계의 대상 항목을 확장함으로써 연계를 현실화할 여지가 있음을 뜻한다.</w:t>
+        <w:lastRenderedPageBreak/>
+        <w:t xml:space="preserve">제도적 측면에서는 국세 </w:t>
+      </w:r>
+      <w:proofErr w:type="spellStart"/>
+      <w:r>
+        <w:rPr>
+          <w:lang w:eastAsia="ko-KR"/>
+        </w:rPr>
+        <w:t>환급금</w:t>
+      </w:r>
+      <w:proofErr w:type="spellEnd"/>
+      <w:r>
+        <w:rPr>
+          <w:lang w:eastAsia="ko-KR"/>
+        </w:rPr>
+        <w:t>, 휴면예금·숨은 금융재산, 카드 포인트 통합조회와 '사망자 등 재산조회 통합처리(안심상속)'처럼 개인이 알지 못하는 금전적 권리를 공공이 대신 조회해 주는 선례가 이미 운영되고 있다. 그러나 의료기관의 미수령 환불금은 현재 이들 조회대상에 포함되어 있지 않아 기존 제도에 자동으로 편입되는 구조는 아니다. 다만 이는 기존 조회체계의 대상 항목을 확장함으로써 연계를 현실화할 여지가 있음을 뜻한다.</w:t>
       </w:r>
     </w:p>
     <w:p>
@@ -1083,7 +1716,25 @@
           <w:sz w:val="20"/>
           <w:lang w:eastAsia="ko-KR"/>
         </w:rPr>
-        <w:t>의료기관 내부 확인 → 환불금 발생 및 미지급 여부 확인 → 환자 사망 여부 확인</w:t>
+        <w:t xml:space="preserve">의료기관 내부 확인 → </w:t>
+      </w:r>
+      <w:proofErr w:type="spellStart"/>
+      <w:r>
+        <w:rPr>
+          <w:rFonts w:ascii="맑은 고딕" w:eastAsia="맑은 고딕" w:hAnsi="맑은 고딕"/>
+          <w:sz w:val="20"/>
+          <w:lang w:eastAsia="ko-KR"/>
+        </w:rPr>
+        <w:t>환불금</w:t>
+      </w:r>
+      <w:proofErr w:type="spellEnd"/>
+      <w:r>
+        <w:rPr>
+          <w:rFonts w:ascii="맑은 고딕" w:eastAsia="맑은 고딕" w:hAnsi="맑은 고딕"/>
+          <w:sz w:val="20"/>
+          <w:lang w:eastAsia="ko-KR"/>
+        </w:rPr>
+        <w:t xml:space="preserve"> 발생 및 미지급 여부 확인 → 환자 사망 여부 확인</w:t>
       </w:r>
     </w:p>
     <w:p>
@@ -1134,7 +1785,25 @@
           <w:sz w:val="20"/>
           <w:lang w:eastAsia="ko-KR"/>
         </w:rPr>
-        <w:t>→ 수령권한 확인 지원 → 의료기관의 환불금 지급 또는 적법한 후속처리</w:t>
+        <w:t xml:space="preserve">→ 수령권한 확인 지원 → 의료기관의 </w:t>
+      </w:r>
+      <w:proofErr w:type="spellStart"/>
+      <w:r>
+        <w:rPr>
+          <w:rFonts w:ascii="맑은 고딕" w:eastAsia="맑은 고딕" w:hAnsi="맑은 고딕"/>
+          <w:sz w:val="20"/>
+          <w:lang w:eastAsia="ko-KR"/>
+        </w:rPr>
+        <w:t>환불금</w:t>
+      </w:r>
+      <w:proofErr w:type="spellEnd"/>
+      <w:r>
+        <w:rPr>
+          <w:rFonts w:ascii="맑은 고딕" w:eastAsia="맑은 고딕" w:hAnsi="맑은 고딕"/>
+          <w:sz w:val="20"/>
+          <w:lang w:eastAsia="ko-KR"/>
+        </w:rPr>
+        <w:t xml:space="preserve"> 지급 또는 적법한 후속처리</w:t>
       </w:r>
     </w:p>
     <w:p>
@@ -1166,6 +1835,7 @@
           <w:b/>
           <w:lang w:eastAsia="ko-KR"/>
         </w:rPr>
+        <w:lastRenderedPageBreak/>
         <w:t>2.4 단계별 관리주체</w:t>
       </w:r>
     </w:p>
@@ -1225,14 +1895,34 @@
             <w:pPr>
               <w:jc w:val="center"/>
             </w:pPr>
+            <w:proofErr w:type="spellStart"/>
             <w:r>
               <w:rPr>
                 <w:rFonts w:ascii="맑은 고딕" w:eastAsia="맑은 고딕" w:hAnsi="맑은 고딕"/>
                 <w:b/>
                 <w:sz w:val="19"/>
               </w:rPr>
-              <w:t>처리 기관</w:t>
+              <w:t>처리</w:t>
             </w:r>
+            <w:proofErr w:type="spellEnd"/>
+            <w:r>
+              <w:rPr>
+                <w:rFonts w:ascii="맑은 고딕" w:eastAsia="맑은 고딕" w:hAnsi="맑은 고딕"/>
+                <w:b/>
+                <w:sz w:val="19"/>
+              </w:rPr>
+              <w:t xml:space="preserve"> </w:t>
+            </w:r>
+            <w:proofErr w:type="spellStart"/>
+            <w:r>
+              <w:rPr>
+                <w:rFonts w:ascii="맑은 고딕" w:eastAsia="맑은 고딕" w:hAnsi="맑은 고딕"/>
+                <w:b/>
+                <w:sz w:val="19"/>
+              </w:rPr>
+              <w:t>기관</w:t>
+            </w:r>
+            <w:proofErr w:type="spellEnd"/>
           </w:p>
         </w:tc>
         <w:tc>
@@ -1287,7 +1977,23 @@
                 <w:sz w:val="19"/>
                 <w:lang w:eastAsia="ko-KR"/>
               </w:rPr>
-              <w:t>진료비 정산, 환불금 발생 및 지급 여부 확인; 미식별 입금 및 미수령 환불금의 예외대상 분류; 개명·가족관계 변화 등 내부정보만으로 판단하기 어려운 대상의 추가 확인 필요성 검토</w:t>
+              <w:t xml:space="preserve">진료비 정산, </w:t>
+            </w:r>
+            <w:proofErr w:type="spellStart"/>
+            <w:r>
+              <w:rPr>
+                <w:sz w:val="19"/>
+                <w:lang w:eastAsia="ko-KR"/>
+              </w:rPr>
+              <w:t>환불금</w:t>
+            </w:r>
+            <w:proofErr w:type="spellEnd"/>
+            <w:r>
+              <w:rPr>
+                <w:sz w:val="19"/>
+                <w:lang w:eastAsia="ko-KR"/>
+              </w:rPr>
+              <w:t xml:space="preserve"> 발생 및 지급 여부 확인; 미식별 입금 및 미수령 환불금의 예외대상 분류; 개명·가족관계 변화 등 내부정보만으로 판단하기 어려운 대상의 추가 확인 필요성 검토</w:t>
             </w:r>
           </w:p>
         </w:tc>
@@ -1301,12 +2007,28 @@
             <w:tcW w:w="4320" w:type="dxa"/>
           </w:tcPr>
           <w:p>
+            <w:proofErr w:type="spellStart"/>
             <w:r>
               <w:rPr>
                 <w:sz w:val="19"/>
               </w:rPr>
-              <w:t>관계 행정기관</w:t>
+              <w:t>관계</w:t>
             </w:r>
+            <w:proofErr w:type="spellEnd"/>
+            <w:r>
+              <w:rPr>
+                <w:sz w:val="19"/>
+              </w:rPr>
+              <w:t xml:space="preserve"> </w:t>
+            </w:r>
+            <w:proofErr w:type="spellStart"/>
+            <w:r>
+              <w:rPr>
+                <w:sz w:val="19"/>
+              </w:rPr>
+              <w:t>행정기관</w:t>
+            </w:r>
+            <w:proofErr w:type="spellEnd"/>
           </w:p>
         </w:tc>
         <w:tc>
@@ -1381,12 +2103,14 @@
             <w:tcW w:w="4320" w:type="dxa"/>
           </w:tcPr>
           <w:p>
+            <w:proofErr w:type="spellStart"/>
             <w:r>
               <w:rPr>
                 <w:sz w:val="19"/>
               </w:rPr>
               <w:t>의료기관</w:t>
             </w:r>
+            <w:proofErr w:type="spellEnd"/>
           </w:p>
         </w:tc>
         <w:tc>
@@ -1418,12 +2142,14 @@
             <w:tcW w:w="4320" w:type="dxa"/>
           </w:tcPr>
           <w:p>
+            <w:proofErr w:type="spellStart"/>
             <w:r>
               <w:rPr>
                 <w:sz w:val="19"/>
               </w:rPr>
               <w:t>중앙정부</w:t>
             </w:r>
+            <w:proofErr w:type="spellEnd"/>
           </w:p>
         </w:tc>
         <w:tc>
@@ -1516,22 +2242,55 @@
         <w:rPr>
           <w:lang w:eastAsia="ko-KR"/>
         </w:rPr>
-        <w:t>미식별 입금은 정상적인 수납정보와 구분하여 별도의 관리대상으로 설정할 필요가 있다. 이를 위해 HIS에서는 입금정보, 환자정보, 매칭정보 및 처리정보를 연계하여 관리하는 구조를 마련할 수 있으며, 주요 관리 항목은 &lt;표 2&gt;와 같이 정리할 수 있다.</w:t>
+        <w:t xml:space="preserve">미식별 입금은 정상적인 수납정보와 구분하여 별도의 관리대상으로 설정할 필요가 있다. 이를 위해 HIS에서는 입금정보, 환자정보, </w:t>
+      </w:r>
+      <w:proofErr w:type="spellStart"/>
+      <w:r>
+        <w:rPr>
+          <w:lang w:eastAsia="ko-KR"/>
+        </w:rPr>
+        <w:t>매칭정보</w:t>
+      </w:r>
+      <w:proofErr w:type="spellEnd"/>
+      <w:r>
+        <w:rPr>
+          <w:lang w:eastAsia="ko-KR"/>
+        </w:rPr>
+        <w:t xml:space="preserve"> 및 처리정보를 연계하여 관리하는 구조를 마련할 수 있으며, 주요 관리 항목은 &lt;표 2&gt;와 같이 정리할 수 있다.</w:t>
       </w:r>
     </w:p>
     <w:p>
       <w:pPr>
-        <w:spacing w:before="160"/>
-        <w:rPr>
-          <w:lang w:eastAsia="ko-KR"/>
-        </w:rPr>
-      </w:pPr>
-      <w:r>
+        <w:spacing w:after="200" w:line="276" w:lineRule="auto"/>
         <w:rPr>
           <w:rFonts w:ascii="맑은 고딕" w:eastAsia="맑은 고딕" w:hAnsi="맑은 고딕"/>
           <w:b/>
           <w:lang w:eastAsia="ko-KR"/>
         </w:rPr>
+      </w:pPr>
+      <w:r>
+        <w:rPr>
+          <w:rFonts w:ascii="맑은 고딕" w:eastAsia="맑은 고딕" w:hAnsi="맑은 고딕"/>
+          <w:b/>
+          <w:lang w:eastAsia="ko-KR"/>
+        </w:rPr>
+        <w:br w:type="page"/>
+      </w:r>
+    </w:p>
+    <w:p>
+      <w:pPr>
+        <w:spacing w:before="160"/>
+        <w:rPr>
+          <w:lang w:eastAsia="ko-KR"/>
+        </w:rPr>
+      </w:pPr>
+      <w:r>
+        <w:rPr>
+          <w:rFonts w:ascii="맑은 고딕" w:eastAsia="맑은 고딕" w:hAnsi="맑은 고딕"/>
+          <w:b/>
+          <w:lang w:eastAsia="ko-KR"/>
+        </w:rPr>
+        <w:lastRenderedPageBreak/>
         <w:t>&lt;표 2&gt; 미식별 입금 관리를 위한 정보 항목 구성</w:t>
       </w:r>
     </w:p>
@@ -1559,6 +2318,7 @@
             <w:pPr>
               <w:jc w:val="center"/>
             </w:pPr>
+            <w:proofErr w:type="spellStart"/>
             <w:r>
               <w:rPr>
                 <w:rFonts w:ascii="맑은 고딕" w:eastAsia="맑은 고딕" w:hAnsi="맑은 고딕"/>
@@ -1567,6 +2327,7 @@
               </w:rPr>
               <w:t>구분</w:t>
             </w:r>
+            <w:proofErr w:type="spellEnd"/>
           </w:p>
         </w:tc>
         <w:tc>
@@ -1635,12 +2396,14 @@
             <w:tcW w:w="4320" w:type="dxa"/>
           </w:tcPr>
           <w:p>
+            <w:proofErr w:type="spellStart"/>
             <w:r>
               <w:rPr>
                 <w:sz w:val="19"/>
               </w:rPr>
               <w:t>환자정보</w:t>
             </w:r>
+            <w:proofErr w:type="spellEnd"/>
           </w:p>
         </w:tc>
         <w:tc>
@@ -1658,7 +2421,23 @@
                 <w:sz w:val="19"/>
                 <w:lang w:eastAsia="ko-KR"/>
               </w:rPr>
-              <w:t>환자번호, 환자명, 진료 여부</w:t>
+              <w:t xml:space="preserve">환자번호, </w:t>
+            </w:r>
+            <w:proofErr w:type="spellStart"/>
+            <w:r>
+              <w:rPr>
+                <w:sz w:val="19"/>
+                <w:lang w:eastAsia="ko-KR"/>
+              </w:rPr>
+              <w:t>환자명</w:t>
+            </w:r>
+            <w:proofErr w:type="spellEnd"/>
+            <w:r>
+              <w:rPr>
+                <w:sz w:val="19"/>
+                <w:lang w:eastAsia="ko-KR"/>
+              </w:rPr>
+              <w:t>, 진료 여부</w:t>
             </w:r>
           </w:p>
         </w:tc>
@@ -1672,12 +2451,14 @@
             <w:tcW w:w="4320" w:type="dxa"/>
           </w:tcPr>
           <w:p>
+            <w:proofErr w:type="spellStart"/>
             <w:r>
               <w:rPr>
                 <w:sz w:val="19"/>
               </w:rPr>
               <w:t>매칭정보</w:t>
             </w:r>
+            <w:proofErr w:type="spellEnd"/>
           </w:p>
         </w:tc>
         <w:tc>
@@ -1695,7 +2476,23 @@
                 <w:sz w:val="19"/>
                 <w:lang w:eastAsia="ko-KR"/>
               </w:rPr>
-              <w:t>환자 매칭 여부, 매칭일자, 확인근거</w:t>
+              <w:t xml:space="preserve">환자 매칭 여부, </w:t>
+            </w:r>
+            <w:proofErr w:type="spellStart"/>
+            <w:r>
+              <w:rPr>
+                <w:sz w:val="19"/>
+                <w:lang w:eastAsia="ko-KR"/>
+              </w:rPr>
+              <w:t>매칭일자</w:t>
+            </w:r>
+            <w:proofErr w:type="spellEnd"/>
+            <w:r>
+              <w:rPr>
+                <w:sz w:val="19"/>
+                <w:lang w:eastAsia="ko-KR"/>
+              </w:rPr>
+              <w:t>, 확인근거</w:t>
             </w:r>
           </w:p>
         </w:tc>
@@ -1709,12 +2506,14 @@
             <w:tcW w:w="4320" w:type="dxa"/>
           </w:tcPr>
           <w:p>
+            <w:proofErr w:type="spellStart"/>
             <w:r>
               <w:rPr>
                 <w:sz w:val="19"/>
               </w:rPr>
               <w:t>확인정보</w:t>
             </w:r>
+            <w:proofErr w:type="spellEnd"/>
           </w:p>
         </w:tc>
         <w:tc>
@@ -1746,12 +2545,14 @@
             <w:tcW w:w="4320" w:type="dxa"/>
           </w:tcPr>
           <w:p>
+            <w:proofErr w:type="spellStart"/>
             <w:r>
               <w:rPr>
                 <w:sz w:val="19"/>
               </w:rPr>
               <w:t>처리정보</w:t>
             </w:r>
+            <w:proofErr w:type="spellEnd"/>
           </w:p>
         </w:tc>
         <w:tc>
@@ -1870,6 +2671,7 @@
             <w:pPr>
               <w:jc w:val="center"/>
             </w:pPr>
+            <w:proofErr w:type="spellStart"/>
             <w:r>
               <w:rPr>
                 <w:rFonts w:ascii="맑은 고딕" w:eastAsia="맑은 고딕" w:hAnsi="맑은 고딕"/>
@@ -1878,6 +2680,7 @@
               </w:rPr>
               <w:t>상태</w:t>
             </w:r>
+            <w:proofErr w:type="spellEnd"/>
           </w:p>
         </w:tc>
         <w:tc>
@@ -1960,11 +2763,47 @@
             <w:tcW w:w="2880" w:type="dxa"/>
           </w:tcPr>
           <w:p>
+            <w:proofErr w:type="spellStart"/>
             <w:r>
               <w:rPr>
                 <w:sz w:val="19"/>
               </w:rPr>
-              <w:t>자동 및 수동 매칭 시도</w:t>
+              <w:t>자동</w:t>
+            </w:r>
+            <w:proofErr w:type="spellEnd"/>
+            <w:r>
+              <w:rPr>
+                <w:sz w:val="19"/>
+              </w:rPr>
+              <w:t xml:space="preserve"> 및 </w:t>
+            </w:r>
+            <w:proofErr w:type="spellStart"/>
+            <w:r>
+              <w:rPr>
+                <w:sz w:val="19"/>
+              </w:rPr>
+              <w:t>수동</w:t>
+            </w:r>
+            <w:proofErr w:type="spellEnd"/>
+            <w:r>
+              <w:rPr>
+                <w:sz w:val="19"/>
+              </w:rPr>
+              <w:t xml:space="preserve"> </w:t>
+            </w:r>
+            <w:proofErr w:type="spellStart"/>
+            <w:r>
+              <w:rPr>
+                <w:sz w:val="19"/>
+              </w:rPr>
+              <w:t>매칭</w:t>
+            </w:r>
+            <w:proofErr w:type="spellEnd"/>
+            <w:r>
+              <w:rPr>
+                <w:sz w:val="19"/>
+              </w:rPr>
+              <w:t xml:space="preserve"> 시도</w:t>
             </w:r>
           </w:p>
         </w:tc>
@@ -2034,12 +2873,28 @@
             <w:tcW w:w="2880" w:type="dxa"/>
           </w:tcPr>
           <w:p>
+            <w:proofErr w:type="spellStart"/>
             <w:r>
               <w:rPr>
                 <w:sz w:val="19"/>
               </w:rPr>
-              <w:t>매칭 완료</w:t>
+              <w:t>매칭</w:t>
             </w:r>
+            <w:proofErr w:type="spellEnd"/>
+            <w:r>
+              <w:rPr>
+                <w:sz w:val="19"/>
+              </w:rPr>
+              <w:t xml:space="preserve"> </w:t>
+            </w:r>
+            <w:proofErr w:type="spellStart"/>
+            <w:r>
+              <w:rPr>
+                <w:sz w:val="19"/>
+              </w:rPr>
+              <w:t>완료</w:t>
+            </w:r>
+            <w:proofErr w:type="spellEnd"/>
           </w:p>
         </w:tc>
         <w:tc>
@@ -2090,12 +2945,28 @@
             <w:tcW w:w="2880" w:type="dxa"/>
           </w:tcPr>
           <w:p>
+            <w:proofErr w:type="spellStart"/>
             <w:r>
               <w:rPr>
                 <w:sz w:val="19"/>
               </w:rPr>
-              <w:t>장기 미식별</w:t>
+              <w:t>장기</w:t>
             </w:r>
+            <w:proofErr w:type="spellEnd"/>
+            <w:r>
+              <w:rPr>
+                <w:sz w:val="19"/>
+              </w:rPr>
+              <w:t xml:space="preserve"> </w:t>
+            </w:r>
+            <w:proofErr w:type="spellStart"/>
+            <w:r>
+              <w:rPr>
+                <w:sz w:val="19"/>
+              </w:rPr>
+              <w:t>미식별</w:t>
+            </w:r>
+            <w:proofErr w:type="spellEnd"/>
           </w:p>
         </w:tc>
         <w:tc>
@@ -2146,12 +3017,28 @@
             <w:tcW w:w="2880" w:type="dxa"/>
           </w:tcPr>
           <w:p>
+            <w:proofErr w:type="spellStart"/>
             <w:r>
               <w:rPr>
                 <w:sz w:val="19"/>
               </w:rPr>
-              <w:t>처리 완료</w:t>
+              <w:t>처리</w:t>
             </w:r>
+            <w:proofErr w:type="spellEnd"/>
+            <w:r>
+              <w:rPr>
+                <w:sz w:val="19"/>
+              </w:rPr>
+              <w:t xml:space="preserve"> </w:t>
+            </w:r>
+            <w:proofErr w:type="spellStart"/>
+            <w:r>
+              <w:rPr>
+                <w:sz w:val="19"/>
+              </w:rPr>
+              <w:t>완료</w:t>
+            </w:r>
+            <w:proofErr w:type="spellEnd"/>
           </w:p>
         </w:tc>
         <w:tc>
@@ -2178,12 +3065,42 @@
             <w:tcW w:w="2880" w:type="dxa"/>
           </w:tcPr>
           <w:p>
+            <w:proofErr w:type="spellStart"/>
             <w:r>
               <w:rPr>
                 <w:sz w:val="19"/>
               </w:rPr>
-              <w:t>처리결과와 이력 보존</w:t>
+              <w:t>처리결과와</w:t>
             </w:r>
+            <w:proofErr w:type="spellEnd"/>
+            <w:r>
+              <w:rPr>
+                <w:sz w:val="19"/>
+              </w:rPr>
+              <w:t xml:space="preserve"> </w:t>
+            </w:r>
+            <w:proofErr w:type="spellStart"/>
+            <w:r>
+              <w:rPr>
+                <w:sz w:val="19"/>
+              </w:rPr>
+              <w:t>이력</w:t>
+            </w:r>
+            <w:proofErr w:type="spellEnd"/>
+            <w:r>
+              <w:rPr>
+                <w:sz w:val="19"/>
+              </w:rPr>
+              <w:t xml:space="preserve"> </w:t>
+            </w:r>
+            <w:proofErr w:type="spellStart"/>
+            <w:r>
+              <w:rPr>
+                <w:sz w:val="19"/>
+              </w:rPr>
+              <w:t>보존</w:t>
+            </w:r>
+            <w:proofErr w:type="spellEnd"/>
           </w:p>
         </w:tc>
       </w:tr>
@@ -2207,17 +3124,36 @@
     </w:p>
     <w:p>
       <w:pPr>
-        <w:spacing w:before="140"/>
-        <w:rPr>
-          <w:lang w:eastAsia="ko-KR"/>
-        </w:rPr>
-      </w:pPr>
-      <w:r>
+        <w:spacing w:after="200" w:line="276" w:lineRule="auto"/>
         <w:rPr>
           <w:rFonts w:ascii="맑은 고딕" w:eastAsia="맑은 고딕" w:hAnsi="맑은 고딕"/>
           <w:b/>
           <w:lang w:eastAsia="ko-KR"/>
         </w:rPr>
+      </w:pPr>
+      <w:r>
+        <w:rPr>
+          <w:rFonts w:ascii="맑은 고딕" w:eastAsia="맑은 고딕" w:hAnsi="맑은 고딕"/>
+          <w:b/>
+          <w:lang w:eastAsia="ko-KR"/>
+        </w:rPr>
+        <w:br w:type="page"/>
+      </w:r>
+    </w:p>
+    <w:p>
+      <w:pPr>
+        <w:spacing w:before="140"/>
+        <w:rPr>
+          <w:lang w:eastAsia="ko-KR"/>
+        </w:rPr>
+      </w:pPr>
+      <w:r>
+        <w:rPr>
+          <w:rFonts w:ascii="맑은 고딕" w:eastAsia="맑은 고딕" w:hAnsi="맑은 고딕"/>
+          <w:b/>
+          <w:lang w:eastAsia="ko-KR"/>
+        </w:rPr>
+        <w:lastRenderedPageBreak/>
         <w:t>3.2 환자정보 매칭과 예외처리</w:t>
       </w:r>
     </w:p>
@@ -2234,7 +3170,21 @@
         <w:rPr>
           <w:lang w:eastAsia="ko-KR"/>
         </w:rPr>
-        <w:t>입금정보와 환자정보의 매칭은 단계적으로 진행하는 것이 바람직하다. 먼저 입금자명과 환자명의 일치 여부를 확인하는 1차 자동매칭을 수행하고, 일치하지 않는 경우에는 진료기간, 환자번호, 기존 수납내역, 등록된 보호자 정보 등 의료기관이 적법하게 확인할 수 있는 정보를 종합하여 후보를 검토한다. 그래도 확정되지 않는 건은 담당자 확인 단계로 넘기되, 이때 사용한 확인 근거를 함께 기록한다.</w:t>
+        <w:t xml:space="preserve">입금정보와 환자정보의 매칭은 단계적으로 진행하는 것이 바람직하다. 먼저 입금자명과 환자명의 일치 여부를 확인하는 1차 </w:t>
+      </w:r>
+      <w:proofErr w:type="spellStart"/>
+      <w:r>
+        <w:rPr>
+          <w:lang w:eastAsia="ko-KR"/>
+        </w:rPr>
+        <w:t>자동매칭을</w:t>
+      </w:r>
+      <w:proofErr w:type="spellEnd"/>
+      <w:r>
+        <w:rPr>
+          <w:lang w:eastAsia="ko-KR"/>
+        </w:rPr>
+        <w:t xml:space="preserve"> 수행하고, 일치하지 않는 경우에는 진료기간, 환자번호, 기존 수납내역, 등록된 보호자 정보 등 의료기관이 적법하게 확인할 수 있는 정보를 종합하여 후보를 검토한다. 그래도 확정되지 않는 건은 담당자 확인 단계로 넘기되, 이때 사용한 확인 근거를 함께 기록한다.</w:t>
       </w:r>
     </w:p>
     <w:p>
@@ -2320,18 +3270,39 @@
     </w:p>
     <w:p>
       <w:pPr>
-        <w:spacing w:before="200" w:after="100"/>
-        <w:rPr>
-          <w:lang w:eastAsia="ko-KR"/>
-        </w:rPr>
-      </w:pPr>
-      <w:r>
+        <w:spacing w:after="200" w:line="276" w:lineRule="auto"/>
         <w:rPr>
           <w:rFonts w:ascii="맑은 고딕" w:eastAsia="맑은 고딕" w:hAnsi="맑은 고딕"/>
           <w:b/>
           <w:sz w:val="23"/>
           <w:lang w:eastAsia="ko-KR"/>
         </w:rPr>
+      </w:pPr>
+      <w:r>
+        <w:rPr>
+          <w:rFonts w:ascii="맑은 고딕" w:eastAsia="맑은 고딕" w:hAnsi="맑은 고딕"/>
+          <w:b/>
+          <w:sz w:val="23"/>
+          <w:lang w:eastAsia="ko-KR"/>
+        </w:rPr>
+        <w:br w:type="page"/>
+      </w:r>
+    </w:p>
+    <w:p>
+      <w:pPr>
+        <w:spacing w:before="200" w:after="100"/>
+        <w:rPr>
+          <w:lang w:eastAsia="ko-KR"/>
+        </w:rPr>
+      </w:pPr>
+      <w:r>
+        <w:rPr>
+          <w:rFonts w:ascii="맑은 고딕" w:eastAsia="맑은 고딕" w:hAnsi="맑은 고딕"/>
+          <w:b/>
+          <w:sz w:val="23"/>
+          <w:lang w:eastAsia="ko-KR"/>
+        </w:rPr>
+        <w:lastRenderedPageBreak/>
         <w:t>4. 사망환자 미수령 환불금의 관리체계</w:t>
       </w:r>
     </w:p>
@@ -2364,7 +3335,21 @@
         <w:rPr>
           <w:lang w:eastAsia="ko-KR"/>
         </w:rPr>
-        <w:t>환불금은 금액이 발생한 시점과 실제 지급이 완료된 시점을 구분하여 관리해야 한다. 환불금이 발생하였으나 지급이 완료되지 않은 경우에는 그 사유와 현재 상태를 별도로 관리하여 장기간 미처리되는 것을 막아야 한다. 이를 위해 HIS에서 다음과 같은 상태값을 관리하는 방안을 제안한다.</w:t>
+        <w:t xml:space="preserve">환불금은 금액이 발생한 시점과 실제 지급이 완료된 시점을 구분하여 관리해야 한다. 환불금이 발생하였으나 지급이 완료되지 않은 경우에는 그 사유와 현재 상태를 별도로 관리하여 장기간 미처리되는 것을 막아야 한다. 이를 위해 HIS에서 다음과 같은 </w:t>
+      </w:r>
+      <w:proofErr w:type="spellStart"/>
+      <w:r>
+        <w:rPr>
+          <w:lang w:eastAsia="ko-KR"/>
+        </w:rPr>
+        <w:t>상태값을</w:t>
+      </w:r>
+      <w:proofErr w:type="spellEnd"/>
+      <w:r>
+        <w:rPr>
+          <w:lang w:eastAsia="ko-KR"/>
+        </w:rPr>
+        <w:t xml:space="preserve"> 관리하는 방안을 제안한다.</w:t>
       </w:r>
     </w:p>
     <w:p>
@@ -2381,7 +3366,25 @@
           <w:sz w:val="20"/>
           <w:lang w:eastAsia="ko-KR"/>
         </w:rPr>
-        <w:t>환불 발생 → 환불 안내 → 지급정보 확인 → 지급 완료 / 미지급</w:t>
+        <w:t xml:space="preserve">환불 발생 → 환불 안내 → 지급정보 확인 → 지급 </w:t>
+      </w:r>
+      <w:proofErr w:type="gramStart"/>
+      <w:r>
+        <w:rPr>
+          <w:rFonts w:ascii="맑은 고딕" w:eastAsia="맑은 고딕" w:hAnsi="맑은 고딕"/>
+          <w:sz w:val="20"/>
+          <w:lang w:eastAsia="ko-KR"/>
+        </w:rPr>
+        <w:t>완료 /</w:t>
+      </w:r>
+      <w:proofErr w:type="gramEnd"/>
+      <w:r>
+        <w:rPr>
+          <w:rFonts w:ascii="맑은 고딕" w:eastAsia="맑은 고딕" w:hAnsi="맑은 고딕"/>
+          <w:sz w:val="20"/>
+          <w:lang w:eastAsia="ko-KR"/>
+        </w:rPr>
+        <w:t xml:space="preserve"> 미지급</w:t>
       </w:r>
     </w:p>
     <w:p>
@@ -2398,7 +3401,25 @@
           <w:sz w:val="20"/>
           <w:lang w:eastAsia="ko-KR"/>
         </w:rPr>
-        <w:t>→ 환자 사망 확인 → 수령권자 확인 필요 → 추가 확인 → 지급 또는 후속처리 완료</w:t>
+        <w:t xml:space="preserve">→ 환자 사망 확인 → </w:t>
+      </w:r>
+      <w:proofErr w:type="spellStart"/>
+      <w:r>
+        <w:rPr>
+          <w:rFonts w:ascii="맑은 고딕" w:eastAsia="맑은 고딕" w:hAnsi="맑은 고딕"/>
+          <w:sz w:val="20"/>
+          <w:lang w:eastAsia="ko-KR"/>
+        </w:rPr>
+        <w:t>수령권자</w:t>
+      </w:r>
+      <w:proofErr w:type="spellEnd"/>
+      <w:r>
+        <w:rPr>
+          <w:rFonts w:ascii="맑은 고딕" w:eastAsia="맑은 고딕" w:hAnsi="맑은 고딕"/>
+          <w:sz w:val="20"/>
+          <w:lang w:eastAsia="ko-KR"/>
+        </w:rPr>
+        <w:t xml:space="preserve"> 확인 필요 → 추가 확인 → 지급 또는 후속처리 완료</w:t>
       </w:r>
     </w:p>
     <w:p>
@@ -2414,7 +3435,21 @@
         <w:rPr>
           <w:lang w:eastAsia="ko-KR"/>
         </w:rPr>
-        <w:t>각 상태값의 의미와 관리 포인트는 &lt;표 4&gt;와 같이 정리할 수 있다.</w:t>
+        <w:t xml:space="preserve">각 </w:t>
+      </w:r>
+      <w:proofErr w:type="spellStart"/>
+      <w:r>
+        <w:rPr>
+          <w:lang w:eastAsia="ko-KR"/>
+        </w:rPr>
+        <w:t>상태값의</w:t>
+      </w:r>
+      <w:proofErr w:type="spellEnd"/>
+      <w:r>
+        <w:rPr>
+          <w:lang w:eastAsia="ko-KR"/>
+        </w:rPr>
+        <w:t xml:space="preserve"> 의미와 관리 포인트는 &lt;표 4&gt;와 같이 정리할 수 있다.</w:t>
       </w:r>
     </w:p>
     <w:p>
@@ -2430,7 +3465,25 @@
           <w:b/>
           <w:lang w:eastAsia="ko-KR"/>
         </w:rPr>
-        <w:t>&lt;표 4&gt; 미수령 환불금의 상태값과 관리 내용</w:t>
+        <w:t xml:space="preserve">&lt;표 4&gt; 미수령 환불금의 </w:t>
+      </w:r>
+      <w:proofErr w:type="spellStart"/>
+      <w:r>
+        <w:rPr>
+          <w:rFonts w:ascii="맑은 고딕" w:eastAsia="맑은 고딕" w:hAnsi="맑은 고딕"/>
+          <w:b/>
+          <w:lang w:eastAsia="ko-KR"/>
+        </w:rPr>
+        <w:t>상태값과</w:t>
+      </w:r>
+      <w:proofErr w:type="spellEnd"/>
+      <w:r>
+        <w:rPr>
+          <w:rFonts w:ascii="맑은 고딕" w:eastAsia="맑은 고딕" w:hAnsi="맑은 고딕"/>
+          <w:b/>
+          <w:lang w:eastAsia="ko-KR"/>
+        </w:rPr>
+        <w:t xml:space="preserve"> 관리 내용</w:t>
       </w:r>
     </w:p>
     <w:tbl>
@@ -2458,6 +3511,7 @@
             <w:pPr>
               <w:jc w:val="center"/>
             </w:pPr>
+            <w:proofErr w:type="spellStart"/>
             <w:r>
               <w:rPr>
                 <w:rFonts w:ascii="맑은 고딕" w:eastAsia="맑은 고딕" w:hAnsi="맑은 고딕"/>
@@ -2466,6 +3520,7 @@
               </w:rPr>
               <w:t>상태값</w:t>
             </w:r>
+            <w:proofErr w:type="spellEnd"/>
           </w:p>
         </w:tc>
         <w:tc>
@@ -2548,12 +3603,56 @@
             <w:tcW w:w="2880" w:type="dxa"/>
           </w:tcPr>
           <w:p>
+            <w:proofErr w:type="spellStart"/>
             <w:r>
               <w:rPr>
                 <w:sz w:val="19"/>
               </w:rPr>
-              <w:t>발생 금액과 사유 기록</w:t>
+              <w:t>발생</w:t>
             </w:r>
+            <w:proofErr w:type="spellEnd"/>
+            <w:r>
+              <w:rPr>
+                <w:sz w:val="19"/>
+              </w:rPr>
+              <w:t xml:space="preserve"> </w:t>
+            </w:r>
+            <w:proofErr w:type="spellStart"/>
+            <w:r>
+              <w:rPr>
+                <w:sz w:val="19"/>
+              </w:rPr>
+              <w:t>금액과</w:t>
+            </w:r>
+            <w:proofErr w:type="spellEnd"/>
+            <w:r>
+              <w:rPr>
+                <w:sz w:val="19"/>
+              </w:rPr>
+              <w:t xml:space="preserve"> </w:t>
+            </w:r>
+            <w:proofErr w:type="spellStart"/>
+            <w:r>
+              <w:rPr>
+                <w:sz w:val="19"/>
+              </w:rPr>
+              <w:t>사유</w:t>
+            </w:r>
+            <w:proofErr w:type="spellEnd"/>
+            <w:r>
+              <w:rPr>
+                <w:sz w:val="19"/>
+              </w:rPr>
+              <w:t xml:space="preserve"> </w:t>
+            </w:r>
+            <w:proofErr w:type="spellStart"/>
+            <w:r>
+              <w:rPr>
+                <w:sz w:val="19"/>
+              </w:rPr>
+              <w:t>기록</w:t>
+            </w:r>
+            <w:proofErr w:type="spellEnd"/>
           </w:p>
         </w:tc>
       </w:tr>
@@ -2598,12 +3697,56 @@
             <w:tcW w:w="2880" w:type="dxa"/>
           </w:tcPr>
           <w:p>
+            <w:proofErr w:type="spellStart"/>
             <w:r>
               <w:rPr>
                 <w:sz w:val="19"/>
               </w:rPr>
-              <w:t>안내 일자와 방법 기록</w:t>
+              <w:t>안내</w:t>
             </w:r>
+            <w:proofErr w:type="spellEnd"/>
+            <w:r>
+              <w:rPr>
+                <w:sz w:val="19"/>
+              </w:rPr>
+              <w:t xml:space="preserve"> </w:t>
+            </w:r>
+            <w:proofErr w:type="spellStart"/>
+            <w:r>
+              <w:rPr>
+                <w:sz w:val="19"/>
+              </w:rPr>
+              <w:t>일자와</w:t>
+            </w:r>
+            <w:proofErr w:type="spellEnd"/>
+            <w:r>
+              <w:rPr>
+                <w:sz w:val="19"/>
+              </w:rPr>
+              <w:t xml:space="preserve"> </w:t>
+            </w:r>
+            <w:proofErr w:type="spellStart"/>
+            <w:r>
+              <w:rPr>
+                <w:sz w:val="19"/>
+              </w:rPr>
+              <w:t>방법</w:t>
+            </w:r>
+            <w:proofErr w:type="spellEnd"/>
+            <w:r>
+              <w:rPr>
+                <w:sz w:val="19"/>
+              </w:rPr>
+              <w:t xml:space="preserve"> </w:t>
+            </w:r>
+            <w:proofErr w:type="spellStart"/>
+            <w:r>
+              <w:rPr>
+                <w:sz w:val="19"/>
+              </w:rPr>
+              <w:t>기록</w:t>
+            </w:r>
+            <w:proofErr w:type="spellEnd"/>
           </w:p>
         </w:tc>
       </w:tr>
@@ -2672,12 +3815,14 @@
             <w:tcW w:w="2880" w:type="dxa"/>
           </w:tcPr>
           <w:p>
+            <w:proofErr w:type="spellStart"/>
             <w:r>
               <w:rPr>
                 <w:sz w:val="19"/>
               </w:rPr>
               <w:t>미지급</w:t>
             </w:r>
+            <w:proofErr w:type="spellEnd"/>
           </w:p>
         </w:tc>
         <w:tc>
@@ -2728,12 +3873,42 @@
             <w:tcW w:w="2880" w:type="dxa"/>
           </w:tcPr>
           <w:p>
+            <w:proofErr w:type="spellStart"/>
             <w:r>
               <w:rPr>
                 <w:sz w:val="19"/>
               </w:rPr>
-              <w:t>수령권자 확인 필요</w:t>
+              <w:t>수령권자</w:t>
             </w:r>
+            <w:proofErr w:type="spellEnd"/>
+            <w:r>
+              <w:rPr>
+                <w:sz w:val="19"/>
+              </w:rPr>
+              <w:t xml:space="preserve"> </w:t>
+            </w:r>
+            <w:proofErr w:type="spellStart"/>
+            <w:r>
+              <w:rPr>
+                <w:sz w:val="19"/>
+              </w:rPr>
+              <w:t>확인</w:t>
+            </w:r>
+            <w:proofErr w:type="spellEnd"/>
+            <w:r>
+              <w:rPr>
+                <w:sz w:val="19"/>
+              </w:rPr>
+              <w:t xml:space="preserve"> </w:t>
+            </w:r>
+            <w:proofErr w:type="spellStart"/>
+            <w:r>
+              <w:rPr>
+                <w:sz w:val="19"/>
+              </w:rPr>
+              <w:t>필요</w:t>
+            </w:r>
+            <w:proofErr w:type="spellEnd"/>
           </w:p>
         </w:tc>
         <w:tc>
@@ -2794,7 +3969,23 @@
                 <w:sz w:val="19"/>
                 <w:lang w:eastAsia="ko-KR"/>
               </w:rPr>
-              <w:t>지급 완료 / 후속처리 완료</w:t>
+              <w:t xml:space="preserve">지급 </w:t>
+            </w:r>
+            <w:proofErr w:type="gramStart"/>
+            <w:r>
+              <w:rPr>
+                <w:sz w:val="19"/>
+                <w:lang w:eastAsia="ko-KR"/>
+              </w:rPr>
+              <w:t>완료 /</w:t>
+            </w:r>
+            <w:proofErr w:type="gramEnd"/>
+            <w:r>
+              <w:rPr>
+                <w:sz w:val="19"/>
+                <w:lang w:eastAsia="ko-KR"/>
+              </w:rPr>
+              <w:t xml:space="preserve"> 후속처리 완료</w:t>
             </w:r>
           </w:p>
         </w:tc>
@@ -2822,12 +4013,42 @@
             <w:tcW w:w="2880" w:type="dxa"/>
           </w:tcPr>
           <w:p>
+            <w:proofErr w:type="spellStart"/>
             <w:r>
               <w:rPr>
                 <w:sz w:val="19"/>
               </w:rPr>
-              <w:t>처리결과와 이력 보존</w:t>
+              <w:t>처리결과와</w:t>
             </w:r>
+            <w:proofErr w:type="spellEnd"/>
+            <w:r>
+              <w:rPr>
+                <w:sz w:val="19"/>
+              </w:rPr>
+              <w:t xml:space="preserve"> </w:t>
+            </w:r>
+            <w:proofErr w:type="spellStart"/>
+            <w:r>
+              <w:rPr>
+                <w:sz w:val="19"/>
+              </w:rPr>
+              <w:t>이력</w:t>
+            </w:r>
+            <w:proofErr w:type="spellEnd"/>
+            <w:r>
+              <w:rPr>
+                <w:sz w:val="19"/>
+              </w:rPr>
+              <w:t xml:space="preserve"> </w:t>
+            </w:r>
+            <w:proofErr w:type="spellStart"/>
+            <w:r>
+              <w:rPr>
+                <w:sz w:val="19"/>
+              </w:rPr>
+              <w:t>보존</w:t>
+            </w:r>
+            <w:proofErr w:type="spellEnd"/>
           </w:p>
         </w:tc>
       </w:tr>
@@ -2851,17 +4072,36 @@
     </w:p>
     <w:p>
       <w:pPr>
-        <w:spacing w:before="140"/>
-        <w:rPr>
-          <w:lang w:eastAsia="ko-KR"/>
-        </w:rPr>
-      </w:pPr>
-      <w:r>
+        <w:spacing w:after="200" w:line="276" w:lineRule="auto"/>
         <w:rPr>
           <w:rFonts w:ascii="맑은 고딕" w:eastAsia="맑은 고딕" w:hAnsi="맑은 고딕"/>
           <w:b/>
           <w:lang w:eastAsia="ko-KR"/>
         </w:rPr>
+      </w:pPr>
+      <w:r>
+        <w:rPr>
+          <w:rFonts w:ascii="맑은 고딕" w:eastAsia="맑은 고딕" w:hAnsi="맑은 고딕"/>
+          <w:b/>
+          <w:lang w:eastAsia="ko-KR"/>
+        </w:rPr>
+        <w:br w:type="page"/>
+      </w:r>
+    </w:p>
+    <w:p>
+      <w:pPr>
+        <w:spacing w:before="140"/>
+        <w:rPr>
+          <w:lang w:eastAsia="ko-KR"/>
+        </w:rPr>
+      </w:pPr>
+      <w:r>
+        <w:rPr>
+          <w:rFonts w:ascii="맑은 고딕" w:eastAsia="맑은 고딕" w:hAnsi="맑은 고딕"/>
+          <w:b/>
+          <w:lang w:eastAsia="ko-KR"/>
+        </w:rPr>
+        <w:lastRenderedPageBreak/>
         <w:t>4.2 사망 여부와 수령권한의 분리</w:t>
       </w:r>
     </w:p>
@@ -2894,7 +4134,21 @@
         <w:rPr>
           <w:lang w:eastAsia="ko-KR"/>
         </w:rPr>
-        <w:t>가족관계의 변화가 있었던 경우에는 병원에 과거 등록된 가족관계 또는 보호자 정보만으로 현재의 법적 관계를 판단하기 어렵다. 이혼 등으로 기존의 가족관계와 현재의 법적 관계가 달라진 경우에는 병원이 보유한 정보와 실제 수령권한을 구분하여 확인해야 한다. 따라서 사망환자의 환불금 관리는 다음의 순서로 진행하는 방안을 제안한다.</w:t>
+        <w:t xml:space="preserve">가족관계의 변화가 있었던 경우에는 병원에 과거 등록된 가족관계 또는 보호자 정보만으로 현재의 법적 관계를 판단하기 어렵다. 이혼 등으로 기존의 가족관계와 현재의 법적 관계가 달라진 경우에는 병원이 보유한 정보와 실제 수령권한을 구분하여 확인해야 한다. 따라서 사망환자의 </w:t>
+      </w:r>
+      <w:proofErr w:type="spellStart"/>
+      <w:r>
+        <w:rPr>
+          <w:lang w:eastAsia="ko-KR"/>
+        </w:rPr>
+        <w:t>환불금</w:t>
+      </w:r>
+      <w:proofErr w:type="spellEnd"/>
+      <w:r>
+        <w:rPr>
+          <w:lang w:eastAsia="ko-KR"/>
+        </w:rPr>
+        <w:t xml:space="preserve"> 관리는 다음의 순서로 진행하는 방안을 제안한다.</w:t>
       </w:r>
     </w:p>
     <w:p>
@@ -2911,7 +4165,25 @@
           <w:sz w:val="20"/>
           <w:lang w:eastAsia="ko-KR"/>
         </w:rPr>
-        <w:t>① 사망 여부 확인 → ② 환불금 발생 및 미지급 여부 확인 → ③ 수령권한 확인 필요 여부 판단</w:t>
+        <w:t xml:space="preserve">① 사망 여부 확인 → ② </w:t>
+      </w:r>
+      <w:proofErr w:type="spellStart"/>
+      <w:r>
+        <w:rPr>
+          <w:rFonts w:ascii="맑은 고딕" w:eastAsia="맑은 고딕" w:hAnsi="맑은 고딕"/>
+          <w:sz w:val="20"/>
+          <w:lang w:eastAsia="ko-KR"/>
+        </w:rPr>
+        <w:t>환불금</w:t>
+      </w:r>
+      <w:proofErr w:type="spellEnd"/>
+      <w:r>
+        <w:rPr>
+          <w:rFonts w:ascii="맑은 고딕" w:eastAsia="맑은 고딕" w:hAnsi="맑은 고딕"/>
+          <w:sz w:val="20"/>
+          <w:lang w:eastAsia="ko-KR"/>
+        </w:rPr>
+        <w:t xml:space="preserve"> 발생 및 미지급 여부 확인 → ③ 수령권한 확인 필요 여부 판단</w:t>
       </w:r>
     </w:p>
     <w:p>
@@ -2977,7 +4249,21 @@
         <w:rPr>
           <w:lang w:eastAsia="ko-KR"/>
         </w:rPr>
-        <w:t>앞서 제시한 연계구조와 미식별 입금·사망환자 환불금 관리체계를 종합하면 예외적 진료비 관련 정보는 다음과 같은 하나의 관리체계로 통합할 수 있다.</w:t>
+        <w:t xml:space="preserve">앞서 제시한 연계구조와 미식별 입금·사망환자 </w:t>
+      </w:r>
+      <w:proofErr w:type="spellStart"/>
+      <w:r>
+        <w:rPr>
+          <w:lang w:eastAsia="ko-KR"/>
+        </w:rPr>
+        <w:t>환불금</w:t>
+      </w:r>
+      <w:proofErr w:type="spellEnd"/>
+      <w:r>
+        <w:rPr>
+          <w:lang w:eastAsia="ko-KR"/>
+        </w:rPr>
+        <w:t xml:space="preserve"> 관리체계를 종합하면 예외적 진료비 관련 정보는 다음과 같은 하나의 관리체계로 통합할 수 있다.</w:t>
       </w:r>
     </w:p>
     <w:p>
@@ -2994,7 +4280,25 @@
           <w:sz w:val="20"/>
           <w:lang w:eastAsia="ko-KR"/>
         </w:rPr>
-        <w:t>진료비 정산 → 입금·환불정보 확인 → 예외대상 분류 → 미식별 입금 또는 미수령 환불금 관리</w:t>
+        <w:t xml:space="preserve">진료비 정산 → 입금·환불정보 확인 → 예외대상 분류 → 미식별 입금 또는 미수령 </w:t>
+      </w:r>
+      <w:proofErr w:type="spellStart"/>
+      <w:r>
+        <w:rPr>
+          <w:rFonts w:ascii="맑은 고딕" w:eastAsia="맑은 고딕" w:hAnsi="맑은 고딕"/>
+          <w:sz w:val="20"/>
+          <w:lang w:eastAsia="ko-KR"/>
+        </w:rPr>
+        <w:t>환불금</w:t>
+      </w:r>
+      <w:proofErr w:type="spellEnd"/>
+      <w:r>
+        <w:rPr>
+          <w:rFonts w:ascii="맑은 고딕" w:eastAsia="맑은 고딕" w:hAnsi="맑은 고딕"/>
+          <w:sz w:val="20"/>
+          <w:lang w:eastAsia="ko-KR"/>
+        </w:rPr>
+        <w:t xml:space="preserve"> 관리</w:t>
       </w:r>
     </w:p>
     <w:p>
@@ -3049,17 +4353,36 @@
     </w:p>
     <w:p>
       <w:pPr>
-        <w:spacing w:before="140"/>
-        <w:rPr>
-          <w:lang w:eastAsia="ko-KR"/>
-        </w:rPr>
-      </w:pPr>
-      <w:r>
+        <w:spacing w:after="200" w:line="276" w:lineRule="auto"/>
         <w:rPr>
           <w:rFonts w:ascii="맑은 고딕" w:eastAsia="맑은 고딕" w:hAnsi="맑은 고딕"/>
           <w:b/>
           <w:lang w:eastAsia="ko-KR"/>
         </w:rPr>
+      </w:pPr>
+      <w:r>
+        <w:rPr>
+          <w:rFonts w:ascii="맑은 고딕" w:eastAsia="맑은 고딕" w:hAnsi="맑은 고딕"/>
+          <w:b/>
+          <w:lang w:eastAsia="ko-KR"/>
+        </w:rPr>
+        <w:br w:type="page"/>
+      </w:r>
+    </w:p>
+    <w:p>
+      <w:pPr>
+        <w:spacing w:before="140"/>
+        <w:rPr>
+          <w:lang w:eastAsia="ko-KR"/>
+        </w:rPr>
+      </w:pPr>
+      <w:r>
+        <w:rPr>
+          <w:rFonts w:ascii="맑은 고딕" w:eastAsia="맑은 고딕" w:hAnsi="맑은 고딕"/>
+          <w:b/>
+          <w:lang w:eastAsia="ko-KR"/>
+        </w:rPr>
+        <w:lastRenderedPageBreak/>
         <w:t>5.2 개인정보 보호와 접근권한</w:t>
       </w:r>
     </w:p>
@@ -3182,24 +4505,73 @@
         <w:rPr>
           <w:lang w:eastAsia="ko-KR"/>
         </w:rPr>
-        <w:t>이 밖에도 조회 화면에서 주민등록번호 등 고유식별정보는 일부를 가려 표시하는 마스킹 처리, 열람·출력 로그의 정기 점검, 담당자 지정과 권한 변경 이력 관리 등의 기술적·관리적 조치가 함께 필요하다. 특히 의료기관이 보유한 진료정보 전체를 공공기관에 제공하는 방식은 본 연구의 목적과 맞지 않는다. 연계가 필요한 경우에도 환자 식별과 환불금 확인에 필요한 범위로 제한하고, 의료정보와 행정정보의 역할을 구분하여 관리하는 것이 적절하다.</w:t>
+        <w:t xml:space="preserve">이 밖에도 조회 화면에서 주민등록번호 등 고유식별정보는 일부를 가려 표시하는 </w:t>
+      </w:r>
+      <w:proofErr w:type="spellStart"/>
+      <w:r>
+        <w:rPr>
+          <w:lang w:eastAsia="ko-KR"/>
+        </w:rPr>
+        <w:t>마스킹</w:t>
+      </w:r>
+      <w:proofErr w:type="spellEnd"/>
+      <w:r>
+        <w:rPr>
+          <w:lang w:eastAsia="ko-KR"/>
+        </w:rPr>
+        <w:t xml:space="preserve"> 처리, 열람·출력 로그의 정기 점검, 담당자 지정과 권한 변경 이력 관리 등의 기술적·관리적 조치가 함께 필요하다. 특히 의료기관이 보유한 진료정보 전체를 공공기관에 제공하는 방식은 본 연구의 목적과 맞지 않는다. 연계가 필요한 경우에도 환자 식별과 </w:t>
+      </w:r>
+      <w:proofErr w:type="spellStart"/>
+      <w:r>
+        <w:rPr>
+          <w:lang w:eastAsia="ko-KR"/>
+        </w:rPr>
+        <w:t>환불금</w:t>
+      </w:r>
+      <w:proofErr w:type="spellEnd"/>
+      <w:r>
+        <w:rPr>
+          <w:lang w:eastAsia="ko-KR"/>
+        </w:rPr>
+        <w:t xml:space="preserve"> 확인에 필요한 범위로 제한하고, 의료정보와 행정정보의 역할을 구분하여 관리하는 것이 적절하다.</w:t>
       </w:r>
     </w:p>
     <w:p>
       <w:pPr>
-        <w:spacing w:before="320" w:after="200"/>
-        <w:jc w:val="center"/>
-        <w:rPr>
-          <w:lang w:eastAsia="ko-KR"/>
-        </w:rPr>
-      </w:pPr>
-      <w:r>
+        <w:spacing w:after="200" w:line="276" w:lineRule="auto"/>
         <w:rPr>
           <w:rFonts w:ascii="맑은 고딕" w:eastAsia="맑은 고딕" w:hAnsi="맑은 고딕"/>
           <w:b/>
           <w:sz w:val="26"/>
           <w:lang w:eastAsia="ko-KR"/>
         </w:rPr>
+      </w:pPr>
+      <w:r>
+        <w:rPr>
+          <w:rFonts w:ascii="맑은 고딕" w:eastAsia="맑은 고딕" w:hAnsi="맑은 고딕"/>
+          <w:b/>
+          <w:sz w:val="26"/>
+          <w:lang w:eastAsia="ko-KR"/>
+        </w:rPr>
+        <w:br w:type="page"/>
+      </w:r>
+    </w:p>
+    <w:p>
+      <w:pPr>
+        <w:spacing w:before="320" w:after="200"/>
+        <w:jc w:val="center"/>
+        <w:rPr>
+          <w:lang w:eastAsia="ko-KR"/>
+        </w:rPr>
+      </w:pPr>
+      <w:r>
+        <w:rPr>
+          <w:rFonts w:ascii="맑은 고딕" w:eastAsia="맑은 고딕" w:hAnsi="맑은 고딕"/>
+          <w:b/>
+          <w:sz w:val="26"/>
+          <w:lang w:eastAsia="ko-KR"/>
+        </w:rPr>
+        <w:lastRenderedPageBreak/>
         <w:t>Ⅴ. 결론</w:t>
       </w:r>
     </w:p>
@@ -3216,7 +4588,21 @@
         <w:rPr>
           <w:lang w:eastAsia="ko-KR"/>
         </w:rPr>
-        <w:t>본 연구는 의료기관 원무행정 과정에서 발생하는 미식별 입금과 미수령 환불금 등 예외적 정산정보가 환자 또는 보호자와의 연락 단절 등으로 장기간 의료기관 내부에 잔류할 수 있다는 점에 주목하여, 이를 체계적으로 관리하기 위한 공공관리체계의 구축방안을 제시하였다. 이러한 금액이 장기간 미처리 상태로 남으면 단순한 행정 미처리에 그치지 않고 귀속과 처리과정의 추적이 어려워지며, 관리상의 사각지대가 생겨 오·남용 가능성에 대한 통제도 어려워진다.</w:t>
+        <w:t xml:space="preserve">본 연구는 의료기관 원무행정 과정에서 발생하는 미식별 입금과 미수령 </w:t>
+      </w:r>
+      <w:proofErr w:type="spellStart"/>
+      <w:r>
+        <w:rPr>
+          <w:lang w:eastAsia="ko-KR"/>
+        </w:rPr>
+        <w:t>환불금</w:t>
+      </w:r>
+      <w:proofErr w:type="spellEnd"/>
+      <w:r>
+        <w:rPr>
+          <w:lang w:eastAsia="ko-KR"/>
+        </w:rPr>
+        <w:t xml:space="preserve"> 등 예외적 정산정보가 환자 또는 보호자와의 연락 단절 등으로 장기간 의료기관 내부에 잔류할 수 있다는 점에 주목하여, 이를 체계적으로 관리하기 위한 공공관리체계의 구축방안을 제시하였다. 이러한 금액이 장기간 미처리 상태로 남으면 단순한 행정 미처리에 그치지 않고 귀속과 처리과정의 추적이 어려워지며, 관리상의 사각지대가 생겨 오·남용 가능성에 대한 통제도 어려워진다.</w:t>
       </w:r>
     </w:p>
     <w:p>
@@ -3232,7 +4618,21 @@
         <w:rPr>
           <w:lang w:eastAsia="ko-KR"/>
         </w:rPr>
-        <w:t>먼저 본 연구는 HIS와 건강보험, 사망, 상속 관련 공공행정정보의 연계 가능성을 검토하였다. 국세 환급금, 휴면예금, 카드 포인트 통합조회와 '사망자 등 재산조회 통합처리(안심상속)'처럼 개인이 알지 못하는 금전적 권리를 공공이 대신 조회해 주는 제도는 이미 운영되고 있으나, 의료기관의 미수령 환불금은 현재 조회대상에 포함되어 있지 않다. 검토 결과, 의료기관이 공공행정정보에 직접 접근하는 방식이 아니라 개인정보 보호법 등 관련 법·제도와 기관별 업무범위를 전제로, 필요한 경우에 한정하여 행정정보를 확인하는 단계적 연계가 현실적인 방향임을 확인하였다.</w:t>
+        <w:t xml:space="preserve">먼저 본 연구는 HIS와 건강보험, 사망, 상속 관련 공공행정정보의 연계 가능성을 검토하였다. 국세 </w:t>
+      </w:r>
+      <w:proofErr w:type="spellStart"/>
+      <w:r>
+        <w:rPr>
+          <w:lang w:eastAsia="ko-KR"/>
+        </w:rPr>
+        <w:t>환급금</w:t>
+      </w:r>
+      <w:proofErr w:type="spellEnd"/>
+      <w:r>
+        <w:rPr>
+          <w:lang w:eastAsia="ko-KR"/>
+        </w:rPr>
+        <w:t>, 휴면예금, 카드 포인트 통합조회와 '사망자 등 재산조회 통합처리(안심상속)'처럼 개인이 알지 못하는 금전적 권리를 공공이 대신 조회해 주는 제도는 이미 운영되고 있으나, 의료기관의 미수령 환불금은 현재 조회대상에 포함되어 있지 않다. 검토 결과, 의료기관이 공공행정정보에 직접 접근하는 방식이 아니라 개인정보 보호법 등 관련 법·제도와 기관별 업무범위를 전제로, 필요한 경우에 한정하여 행정정보를 확인하는 단계적 연계가 현실적인 방향임을 확인하였다.</w:t>
       </w:r>
     </w:p>
     <w:p>
@@ -3280,7 +4680,36 @@
         <w:rPr>
           <w:lang w:eastAsia="ko-KR"/>
         </w:rPr>
-        <w:t>아울러 권리자에게 환급하기 위한 절차를 모두 거친 뒤에도 끝내 수령되지 않는 금액에 대해서는 그 종국 처리 방안을 함께 검토할 필요가 있다. 현행 제도에서 미수령 금액은 소멸시효가 완성되면 국고로 귀속되나 그 용도는 특정되어 있지 않다. 다만 휴면예금을 서민금융진흥원에 귀속시켜 취약계층 지원에 활용하는 「서민의 금융생활 지원에 관한 법률」의 사례처럼, 장기 미수령 환불금을 공익 목적 기금에 귀속시켜 사회 소외계층 지원이나 공공 의료연구에 활용하는 방안도 입법적으로 검토할 여지가 있다. 이는 재산권 보호와 소멸시효, 권리자 보호를 우선 전제하는 별도 특별법이 필요하므로, 본 연구의 범위를 넘어 후속 입법 연구의 과제로 남긴다.</w:t>
+        <w:lastRenderedPageBreak/>
+        <w:t xml:space="preserve">아울러 권리자에게 환급하기 위한 절차를 모두 거친 뒤에도 끝내 </w:t>
+      </w:r>
+      <w:proofErr w:type="spellStart"/>
+      <w:r>
+        <w:rPr>
+          <w:lang w:eastAsia="ko-KR"/>
+        </w:rPr>
+        <w:t>수령되지</w:t>
+      </w:r>
+      <w:proofErr w:type="spellEnd"/>
+      <w:r>
+        <w:rPr>
+          <w:lang w:eastAsia="ko-KR"/>
+        </w:rPr>
+        <w:t xml:space="preserve"> 않는 금액에 대해서는 그 종국 처리 방안을 함께 검토할 필요가 있다. 현행 제도에서 미수령 금액은 소멸시효가 완성되면 국고로 귀속되나 그 용도는 특정되어 있지 않다. 다만 휴면예금을 서민금융진흥원에 귀속시켜 취약계층 지원에 활용하는 「서민의 금융생활 지원에 관한 </w:t>
+      </w:r>
+      <w:proofErr w:type="spellStart"/>
+      <w:r>
+        <w:rPr>
+          <w:lang w:eastAsia="ko-KR"/>
+        </w:rPr>
+        <w:t>법률」의</w:t>
+      </w:r>
+      <w:proofErr w:type="spellEnd"/>
+      <w:r>
+        <w:rPr>
+          <w:lang w:eastAsia="ko-KR"/>
+        </w:rPr>
+        <w:t xml:space="preserve"> 사례처럼, 장기 미수령 환불금을 공익 목적 기금에 귀속시켜 사회 소외계층 지원이나 공공 의료연구에 활용하는 방안도 입법적으로 검토할 여지가 있다. 이는 재산권 보호와 소멸시효, 권리자 보호를 우선 전제하는 별도 특별법이 필요하므로, 본 연구의 범위를 넘어 후속 입법 연구의 과제로 남긴다.</w:t>
       </w:r>
     </w:p>
     <w:p>
@@ -3316,6 +4745,16 @@
           <w:sz w:val="26"/>
           <w:lang w:eastAsia="ko-KR"/>
         </w:rPr>
+        <w:br w:type="page"/>
+      </w:r>
+      <w:r>
+        <w:rPr>
+          <w:rFonts w:ascii="맑은 고딕" w:eastAsia="맑은 고딕" w:hAnsi="맑은 고딕"/>
+          <w:b/>
+          <w:sz w:val="26"/>
+          <w:lang w:eastAsia="ko-KR"/>
+        </w:rPr>
+        <w:lastRenderedPageBreak/>
         <w:t>참 고 문 헌</w:t>
       </w:r>
     </w:p>
@@ -3327,12 +4766,53 @@
           <w:lang w:eastAsia="ko-KR"/>
         </w:rPr>
       </w:pPr>
+      <w:proofErr w:type="spellStart"/>
       <w:r>
         <w:rPr>
           <w:sz w:val="20"/>
           <w:lang w:eastAsia="ko-KR"/>
         </w:rPr>
-        <w:t>김상미, 이해종, 신동교(2013). 활동기준원가를 이용한 충수절제술과 폐렴의 경제적 재원일과 재원일 단축에 따른 기회이익. 『보건행정학회지』, 23(2), 124-131.</w:t>
+        <w:t>김상미</w:t>
+      </w:r>
+      <w:proofErr w:type="spellEnd"/>
+      <w:r>
+        <w:rPr>
+          <w:sz w:val="20"/>
+          <w:lang w:eastAsia="ko-KR"/>
+        </w:rPr>
+        <w:t xml:space="preserve">, </w:t>
+      </w:r>
+      <w:proofErr w:type="spellStart"/>
+      <w:r>
+        <w:rPr>
+          <w:sz w:val="20"/>
+          <w:lang w:eastAsia="ko-KR"/>
+        </w:rPr>
+        <w:t>이해종</w:t>
+      </w:r>
+      <w:proofErr w:type="spellEnd"/>
+      <w:r>
+        <w:rPr>
+          <w:sz w:val="20"/>
+          <w:lang w:eastAsia="ko-KR"/>
+        </w:rPr>
+        <w:t xml:space="preserve">, </w:t>
+      </w:r>
+      <w:proofErr w:type="spellStart"/>
+      <w:r>
+        <w:rPr>
+          <w:sz w:val="20"/>
+          <w:lang w:eastAsia="ko-KR"/>
+        </w:rPr>
+        <w:t>신동교</w:t>
+      </w:r>
+      <w:proofErr w:type="spellEnd"/>
+      <w:r>
+        <w:rPr>
+          <w:sz w:val="20"/>
+          <w:lang w:eastAsia="ko-KR"/>
+        </w:rPr>
+        <w:t>(2013). 활동기준원가를 이용한 충수절제술과 폐렴의 경제적 재원일과 재원일 단축에 따른 기회이익. 『보건행정학회지』, 23(2), 124-131.</w:t>
       </w:r>
     </w:p>
     <w:p>
@@ -3386,7 +4866,55 @@
           <w:sz w:val="20"/>
           <w:lang w:eastAsia="ko-KR"/>
         </w:rPr>
-        <w:t>김진아, 이무식, 황혜정, 김광환(2016). 일부지역 의료기관의 외래원무관리 표준화에 관한 연구. 『한국산학기술학회논문지』, 17(7), 357-366.</w:t>
+        <w:t xml:space="preserve">김진아, </w:t>
+      </w:r>
+      <w:proofErr w:type="spellStart"/>
+      <w:r>
+        <w:rPr>
+          <w:sz w:val="20"/>
+          <w:lang w:eastAsia="ko-KR"/>
+        </w:rPr>
+        <w:t>이무식</w:t>
+      </w:r>
+      <w:proofErr w:type="spellEnd"/>
+      <w:r>
+        <w:rPr>
+          <w:sz w:val="20"/>
+          <w:lang w:eastAsia="ko-KR"/>
+        </w:rPr>
+        <w:t xml:space="preserve">, 황혜정, </w:t>
+      </w:r>
+      <w:proofErr w:type="spellStart"/>
+      <w:r>
+        <w:rPr>
+          <w:sz w:val="20"/>
+          <w:lang w:eastAsia="ko-KR"/>
+        </w:rPr>
+        <w:t>김광환</w:t>
+      </w:r>
+      <w:proofErr w:type="spellEnd"/>
+      <w:r>
+        <w:rPr>
+          <w:sz w:val="20"/>
+          <w:lang w:eastAsia="ko-KR"/>
+        </w:rPr>
+        <w:t>(2016). 일부지역 의료기관의 외래원무관리 표준화에 관한 연구. 『</w:t>
+      </w:r>
+      <w:proofErr w:type="spellStart"/>
+      <w:r>
+        <w:rPr>
+          <w:sz w:val="20"/>
+          <w:lang w:eastAsia="ko-KR"/>
+        </w:rPr>
+        <w:t>한국산학기술학회논문지</w:t>
+      </w:r>
+      <w:proofErr w:type="spellEnd"/>
+      <w:r>
+        <w:rPr>
+          <w:sz w:val="20"/>
+          <w:lang w:eastAsia="ko-KR"/>
+        </w:rPr>
+        <w:t>』, 17(7), 357-366.</w:t>
       </w:r>
     </w:p>
     <w:p>
@@ -3402,7 +4930,23 @@
           <w:sz w:val="20"/>
           <w:lang w:eastAsia="ko-KR"/>
         </w:rPr>
-        <w:t>박찬석, 이현우, 고석하(2008). 병원정보시스템 사용성에 대한 실증연구. 『경영정보학연구』, 10(3), 289-311.</w:t>
+        <w:t xml:space="preserve">박찬석, 이현우, </w:t>
+      </w:r>
+      <w:proofErr w:type="spellStart"/>
+      <w:r>
+        <w:rPr>
+          <w:sz w:val="20"/>
+          <w:lang w:eastAsia="ko-KR"/>
+        </w:rPr>
+        <w:t>고석하</w:t>
+      </w:r>
+      <w:proofErr w:type="spellEnd"/>
+      <w:r>
+        <w:rPr>
+          <w:sz w:val="20"/>
+          <w:lang w:eastAsia="ko-KR"/>
+        </w:rPr>
+        <w:t>(2008). 병원정보시스템 사용성에 대한 실증연구. 『경영정보학연구』, 10(3), 289-311.</w:t>
       </w:r>
     </w:p>
     <w:p>
@@ -3413,12 +4957,53 @@
           <w:lang w:eastAsia="ko-KR"/>
         </w:rPr>
       </w:pPr>
+      <w:proofErr w:type="spellStart"/>
       <w:r>
         <w:rPr>
           <w:sz w:val="20"/>
           <w:lang w:eastAsia="ko-KR"/>
         </w:rPr>
-        <w:t>신아미, 박희준, 정선주, 노미진, 김윤년(2009). 종이의무기록과 전자의무기록의 기재정도 및 일치도 비교 연구: 심방세동 환자 입원기록을 중심으로. 『대한의료정보학회지』, 15(2), 201-208.</w:t>
+        <w:t>신아미</w:t>
+      </w:r>
+      <w:proofErr w:type="spellEnd"/>
+      <w:r>
+        <w:rPr>
+          <w:sz w:val="20"/>
+          <w:lang w:eastAsia="ko-KR"/>
+        </w:rPr>
+        <w:t xml:space="preserve">, 박희준, 정선주, 노미진, </w:t>
+      </w:r>
+      <w:proofErr w:type="spellStart"/>
+      <w:r>
+        <w:rPr>
+          <w:sz w:val="20"/>
+          <w:lang w:eastAsia="ko-KR"/>
+        </w:rPr>
+        <w:t>김윤년</w:t>
+      </w:r>
+      <w:proofErr w:type="spellEnd"/>
+      <w:r>
+        <w:rPr>
+          <w:sz w:val="20"/>
+          <w:lang w:eastAsia="ko-KR"/>
+        </w:rPr>
+        <w:t>(2009). 종이의무기록과 전자의무기록의 기재정도 및 일치도 비교 연구: 심방세동 환자 입원기록을 중심으로. 『</w:t>
+      </w:r>
+      <w:proofErr w:type="spellStart"/>
+      <w:r>
+        <w:rPr>
+          <w:sz w:val="20"/>
+          <w:lang w:eastAsia="ko-KR"/>
+        </w:rPr>
+        <w:t>대한의료정보학회지</w:t>
+      </w:r>
+      <w:proofErr w:type="spellEnd"/>
+      <w:r>
+        <w:rPr>
+          <w:sz w:val="20"/>
+          <w:lang w:eastAsia="ko-KR"/>
+        </w:rPr>
+        <w:t>』, 15(2), 201-208.</w:t>
       </w:r>
     </w:p>
     <w:p>
@@ -3429,12 +5014,53 @@
           <w:lang w:eastAsia="ko-KR"/>
         </w:rPr>
       </w:pPr>
+      <w:proofErr w:type="spellStart"/>
       <w:r>
         <w:rPr>
           <w:sz w:val="20"/>
           <w:lang w:eastAsia="ko-KR"/>
         </w:rPr>
-        <w:t>양유정(2012). 의료기관 운영요인과 환경요인이 진료비 삭감률에 미치는 영향에 관한 연구. 『디지털융복합연구』, 10(11), 493-502.</w:t>
+        <w:t>양유정</w:t>
+      </w:r>
+      <w:proofErr w:type="spellEnd"/>
+      <w:r>
+        <w:rPr>
+          <w:sz w:val="20"/>
+          <w:lang w:eastAsia="ko-KR"/>
+        </w:rPr>
+        <w:t xml:space="preserve">(2012). 의료기관 운영요인과 환경요인이 진료비 </w:t>
+      </w:r>
+      <w:proofErr w:type="spellStart"/>
+      <w:r>
+        <w:rPr>
+          <w:sz w:val="20"/>
+          <w:lang w:eastAsia="ko-KR"/>
+        </w:rPr>
+        <w:t>삭감률에</w:t>
+      </w:r>
+      <w:proofErr w:type="spellEnd"/>
+      <w:r>
+        <w:rPr>
+          <w:sz w:val="20"/>
+          <w:lang w:eastAsia="ko-KR"/>
+        </w:rPr>
+        <w:t xml:space="preserve"> 미치는 영향에 관한 연구. 『</w:t>
+      </w:r>
+      <w:proofErr w:type="spellStart"/>
+      <w:r>
+        <w:rPr>
+          <w:sz w:val="20"/>
+          <w:lang w:eastAsia="ko-KR"/>
+        </w:rPr>
+        <w:t>디지털융복합연구</w:t>
+      </w:r>
+      <w:proofErr w:type="spellEnd"/>
+      <w:r>
+        <w:rPr>
+          <w:sz w:val="20"/>
+          <w:lang w:eastAsia="ko-KR"/>
+        </w:rPr>
+        <w:t>』, 10(11), 493-502.</w:t>
       </w:r>
     </w:p>
     <w:p>
@@ -3450,7 +5076,23 @@
           <w:sz w:val="20"/>
           <w:lang w:eastAsia="ko-KR"/>
         </w:rPr>
-        <w:t>이민영(2011). 행정정보의 활용과 개인정보의 보호. 『가천법학』, 4(3), 55-88.</w:t>
+        <w:t>이민영(2011). 행정정보의 활용과 개인정보의 보호. 『</w:t>
+      </w:r>
+      <w:proofErr w:type="spellStart"/>
+      <w:r>
+        <w:rPr>
+          <w:sz w:val="20"/>
+          <w:lang w:eastAsia="ko-KR"/>
+        </w:rPr>
+        <w:t>가천법학</w:t>
+      </w:r>
+      <w:proofErr w:type="spellEnd"/>
+      <w:r>
+        <w:rPr>
+          <w:sz w:val="20"/>
+          <w:lang w:eastAsia="ko-KR"/>
+        </w:rPr>
+        <w:t>』, 4(3), 55-88.</w:t>
       </w:r>
     </w:p>
     <w:p>
@@ -3466,7 +5108,39 @@
           <w:sz w:val="20"/>
           <w:lang w:eastAsia="ko-KR"/>
         </w:rPr>
-        <w:t>이주연, 김용, 김건(2013). 대형 대학병원의 의무기록관리 현황분석 및 개선방안에 관한 연구. 『한국기록관리학회지』, 13(1), 107-134.</w:t>
+        <w:t xml:space="preserve">이주연, 김용, </w:t>
+      </w:r>
+      <w:proofErr w:type="spellStart"/>
+      <w:r>
+        <w:rPr>
+          <w:sz w:val="20"/>
+          <w:lang w:eastAsia="ko-KR"/>
+        </w:rPr>
+        <w:t>김건</w:t>
+      </w:r>
+      <w:proofErr w:type="spellEnd"/>
+      <w:r>
+        <w:rPr>
+          <w:sz w:val="20"/>
+          <w:lang w:eastAsia="ko-KR"/>
+        </w:rPr>
+        <w:t>(2013). 대형 대학병원의 의무기록관리 현황분석 및 개선방안에 관한 연구. 『</w:t>
+      </w:r>
+      <w:proofErr w:type="spellStart"/>
+      <w:r>
+        <w:rPr>
+          <w:sz w:val="20"/>
+          <w:lang w:eastAsia="ko-KR"/>
+        </w:rPr>
+        <w:t>한국기록관리학회지</w:t>
+      </w:r>
+      <w:proofErr w:type="spellEnd"/>
+      <w:r>
+        <w:rPr>
+          <w:sz w:val="20"/>
+          <w:lang w:eastAsia="ko-KR"/>
+        </w:rPr>
+        <w:t>』, 13(1), 107-134.</w:t>
       </w:r>
     </w:p>
     <w:p>
@@ -3477,12 +5151,21 @@
           <w:lang w:eastAsia="ko-KR"/>
         </w:rPr>
       </w:pPr>
+      <w:proofErr w:type="spellStart"/>
       <w:r>
         <w:rPr>
           <w:sz w:val="20"/>
           <w:lang w:eastAsia="ko-KR"/>
         </w:rPr>
-        <w:t>조영순(2006). 한 대학병원 산재보험 입원 환자의 본인부담금 실태 분석. 석사학위논문, 연세대학교 보건대학원.</w:t>
+        <w:t>조영순</w:t>
+      </w:r>
+      <w:proofErr w:type="spellEnd"/>
+      <w:r>
+        <w:rPr>
+          <w:sz w:val="20"/>
+          <w:lang w:eastAsia="ko-KR"/>
+        </w:rPr>
+        <w:t>(2006). 한 대학병원 산재보험 입원 환자의 본인부담금 실태 분석. 석사학위논문, 연세대학교 보건대학원.</w:t>
       </w:r>
     </w:p>
     <w:p>
@@ -3687,8 +5370,8 @@
       </w:r>
     </w:p>
     <w:sectPr>
-      <w:pgSz w:w="12240" w:h="15840"/>
-      <w:pgMar w:top="1440" w:right="1800" w:bottom="1440" w:left="1800" w:header="720" w:footer="720" w:gutter="0"/>
+      <w:pgSz w:w="11907" w:h="16840" w:code="9"/>
+      <w:pgMar w:top="1701" w:right="1440" w:bottom="1440" w:left="1440" w:header="720" w:footer="720" w:gutter="0"/>
       <w:cols w:space="720"/>
       <w:docGrid w:linePitch="360"/>
     </w:sectPr>

</xml_diff>